<commit_message>
Clarify specification basis and test-driven additions in Persian response
</commit_message>
<xml_diff>
--- a/docs/downloads/RESCUE_Response_FA_3.0.1.docx
+++ b/docs/downloads/RESCUE_Response_FA_3.0.1.docx
@@ -99,7 +99,7 @@
           <w:bCs w:val="0"/>
           <w:lang w:val="en-US" w:bidi="fa-IR"/>
         </w:rPr>
-        <w:t xml:space="preserve">حالت پروازی </w:t>
+        <w:t xml:space="preserve">حالت نجات </w:t>
       </w:r>
       <w:r>
         <w:rPr>
@@ -112,7 +112,7 @@
           <w:bCs w:val="0"/>
           <w:lang w:val="en-US" w:bidi="fa-IR"/>
         </w:rPr>
-        <w:t>‎RESCUE‎</w:t>
+        <w:t xml:space="preserve">‎RESCUE‎ </w:t>
       </w:r>
       <w:r>
         <w:rPr>
@@ -125,7 +125,20 @@
           <w:bCs w:val="0"/>
           <w:lang w:val="en-US" w:bidi="fa-IR"/>
         </w:rPr>
-        <w:t xml:space="preserve"> </w:t>
+        <w:t xml:space="preserve">را برای پرنده بال‌ثابت روی </w:t>
+      </w:r>
+      <w:r>
+        <w:rPr>
+          <w:rFonts w:ascii="Vazirmatn" w:hAnsi="Vazirmatn" w:cs="Vazirmatn" w:eastAsia="Vazirmatn"/>
+          <w:b w:val="0"/>
+          <w:color w:val="000000"/>
+          <w:sz w:val="23"/>
+          <w:szCs w:val="23"/>
+          <w:rtl w:val="0"/>
+          <w:bCs w:val="0"/>
+          <w:lang w:val="en-US" w:bidi="fa-IR"/>
+        </w:rPr>
+        <w:t xml:space="preserve">‎ArduPlane 4.6.3‎ </w:t>
       </w:r>
       <w:r>
         <w:rPr>
@@ -138,7 +151,7 @@
           <w:bCs w:val="0"/>
           <w:lang w:val="en-US" w:bidi="fa-IR"/>
         </w:rPr>
-        <w:t xml:space="preserve">و ناظر تشخیص خطر را روی </w:t>
+        <w:t xml:space="preserve">پیاده کرده‌ایم. تصمیم‌گیری و کنترل نجات داخل فریمور انجام می‌شود؛ پنل و </w:t>
       </w:r>
       <w:r>
         <w:rPr>
@@ -151,7 +164,7 @@
           <w:bCs w:val="0"/>
           <w:lang w:val="en-US" w:bidi="fa-IR"/>
         </w:rPr>
-        <w:t>‎ArduPlane 4.6.3‎</w:t>
+        <w:t xml:space="preserve">‎QGroundControl‎ </w:t>
       </w:r>
       <w:r>
         <w:rPr>
@@ -164,59 +177,7 @@
           <w:bCs w:val="0"/>
           <w:lang w:val="en-US" w:bidi="fa-IR"/>
         </w:rPr>
-        <w:t xml:space="preserve"> </w:t>
-      </w:r>
-      <w:r>
-        <w:rPr>
-          <w:rFonts w:ascii="Vazirmatn" w:hAnsi="Vazirmatn" w:cs="Vazirmatn" w:eastAsia="Vazirmatn"/>
-          <w:b w:val="0"/>
-          <w:color w:val="000000"/>
-          <w:sz w:val="23"/>
-          <w:szCs w:val="23"/>
-          <w:rtl w:val="1"/>
-          <w:bCs w:val="0"/>
-          <w:lang w:val="en-US" w:bidi="fa-IR"/>
-        </w:rPr>
-        <w:t xml:space="preserve">برای پرنده بال‌ثابت پیاده کرده‌ایم. منطق نجات داخل فریمور اجرا می‌شود. پنل محلی، راه‌اندازی شبیه‌ساز، نمایش وضعیت و بررسی لاگ را انجام می‌دهد؛ بسته برای کارکرد مستقل از پنل با </w:t>
-      </w:r>
-      <w:r>
-        <w:rPr>
-          <w:rFonts w:ascii="Vazirmatn" w:hAnsi="Vazirmatn" w:cs="Vazirmatn" w:eastAsia="Vazirmatn"/>
-          <w:b w:val="0"/>
-          <w:color w:val="000000"/>
-          <w:sz w:val="23"/>
-          <w:szCs w:val="23"/>
-          <w:rtl w:val="0"/>
-          <w:bCs w:val="0"/>
-          <w:lang w:val="en-US" w:bidi="fa-IR"/>
-        </w:rPr>
-        <w:t>‎QGroundControl‎</w:t>
-      </w:r>
-      <w:r>
-        <w:rPr>
-          <w:rFonts w:ascii="Vazirmatn" w:hAnsi="Vazirmatn" w:cs="Vazirmatn" w:eastAsia="Vazirmatn"/>
-          <w:b w:val="0"/>
-          <w:color w:val="000000"/>
-          <w:sz w:val="23"/>
-          <w:szCs w:val="23"/>
-          <w:rtl w:val="1"/>
-          <w:bCs w:val="0"/>
-          <w:lang w:val="en-US" w:bidi="fa-IR"/>
-        </w:rPr>
-        <w:t xml:space="preserve"> </w:t>
-      </w:r>
-      <w:r>
-        <w:rPr>
-          <w:rFonts w:ascii="Vazirmatn" w:hAnsi="Vazirmatn" w:cs="Vazirmatn" w:eastAsia="Vazirmatn"/>
-          <w:b w:val="0"/>
-          <w:color w:val="000000"/>
-          <w:sz w:val="23"/>
-          <w:szCs w:val="23"/>
-          <w:rtl w:val="1"/>
-          <w:bCs w:val="0"/>
-          <w:lang w:val="en-US" w:bidi="fa-IR"/>
-        </w:rPr>
-        <w:t>نیز راه‌انداز دارد.</w:t>
+        <w:t xml:space="preserve">برای هدایت شبیه‌ساز و بررسی نتیجه‌اند.</w:t>
       </w:r>
     </w:p>
     <w:p>
@@ -237,7 +198,7 @@
           <w:bCs w:val="0"/>
           <w:lang w:val="en-US" w:bidi="fa-IR"/>
         </w:rPr>
-        <w:t xml:space="preserve">هفت سناریوی درخواستی در هشت پرواز مستقل </w:t>
+        <w:t xml:space="preserve">بند ۳ سند اصلی، افزودن تنظیمات ضروری را با توضیح در </w:t>
       </w:r>
       <w:r>
         <w:rPr>
@@ -250,7 +211,7 @@
           <w:bCs w:val="0"/>
           <w:lang w:val="en-US" w:bidi="fa-IR"/>
         </w:rPr>
-        <w:t>‎SITL‎</w:t>
+        <w:t xml:space="preserve">‎README‎ </w:t>
       </w:r>
       <w:r>
         <w:rPr>
@@ -263,7 +224,104 @@
           <w:bCs w:val="0"/>
           <w:lang w:val="en-US" w:bidi="fa-IR"/>
         </w:rPr>
-        <w:t xml:space="preserve"> </w:t>
+        <w:t xml:space="preserve">مجاز می‌داند. پنج پارامتر اصلی را حفظ کرده‌ایم و برای تصمیم‌هایی که حد عددی نداشتند، تنظیمات تکمیلی گذاشته‌ایم.</w:t>
+      </w:r>
+    </w:p>
+    <w:p>
+      <w:pPr>
+        <w:widowControl/>
+        <w:bidi w:val="1"/>
+        <w:spacing w:after="120" w:line="288" w:lineRule="auto"/>
+        <w:jc w:val="start"/>
+      </w:pPr>
+      <w:r>
+        <w:rPr>
+          <w:rFonts w:ascii="Vazirmatn" w:hAnsi="Vazirmatn" w:cs="Vazirmatn" w:eastAsia="Vazirmatn"/>
+          <w:b w:val="0"/>
+          <w:color w:val="000000"/>
+          <w:sz w:val="23"/>
+          <w:szCs w:val="23"/>
+          <w:rtl w:val="1"/>
+          <w:bCs w:val="0"/>
+          <w:lang w:val="en-US" w:bidi="fa-IR"/>
+        </w:rPr>
+        <w:t xml:space="preserve">در نسخه‌های اولیه، تیک‌آف و مانور کوتاه می‌توانستند با سقوط اشتباه شوند. برای اجرای «تداوم شرط» در بند ۴٫۱ و جلوگیری از رفت‌وبرگشت مکرر در بند ۵، تأیید زمانی نزول و حاشیه بازگشت اضافه کردیم.</w:t>
+      </w:r>
+    </w:p>
+    <w:p>
+      <w:pPr>
+        <w:widowControl/>
+        <w:bidi w:val="1"/>
+        <w:spacing w:after="120" w:line="288" w:lineRule="auto"/>
+        <w:jc w:val="start"/>
+      </w:pPr>
+      <w:r>
+        <w:rPr>
+          <w:rFonts w:ascii="Vazirmatn" w:hAnsi="Vazirmatn" w:cs="Vazirmatn" w:eastAsia="Vazirmatn"/>
+          <w:b w:val="0"/>
+          <w:color w:val="000000"/>
+          <w:sz w:val="23"/>
+          <w:szCs w:val="23"/>
+          <w:rtl w:val="1"/>
+          <w:bCs w:val="0"/>
+          <w:lang w:val="en-US" w:bidi="fa-IR"/>
+        </w:rPr>
+        <w:t xml:space="preserve">بند ۴٫۴، افق پایدار را می‌خواهد و سناریوی ۶ بخش ۷، نجات هنگام اوج‌نگرفتن را. برای تشخیص آن‌ها، حدود پایداری و مهلت بررسی پیشرفت تعیین کردیم. چون گاز کامل همیشه به اوج‌گیری نمی‌انجامد، افزایش سرعت هوایی را هم در بازیابی انرژی لحاظ کردیم.</w:t>
+      </w:r>
+    </w:p>
+    <w:p>
+      <w:pPr>
+        <w:widowControl/>
+        <w:bidi w:val="1"/>
+        <w:spacing w:after="120" w:line="288" w:lineRule="auto"/>
+        <w:jc w:val="start"/>
+      </w:pPr>
+      <w:r>
+        <w:rPr>
+          <w:rFonts w:ascii="Vazirmatn" w:hAnsi="Vazirmatn" w:cs="Vazirmatn" w:eastAsia="Vazirmatn"/>
+          <w:b w:val="0"/>
+          <w:color w:val="000000"/>
+          <w:sz w:val="23"/>
+          <w:szCs w:val="23"/>
+          <w:rtl w:val="1"/>
+          <w:bCs w:val="0"/>
+          <w:lang w:val="en-US" w:bidi="fa-IR"/>
+        </w:rPr>
+        <w:t xml:space="preserve">در یک نزول تند ثبت‌شده، پرنده تا حدود ۳۰ متر پایین آمد، اما شتاب نزدیک صفر بود و شرط شتابی فعال نشد. حفاظت نزول ثابت را با توجه به هدف نجات در بند ۱ افزودیم؛ این قابلیت از شرط صریح بند ۴٫۲ فراتر است.</w:t>
+      </w:r>
+    </w:p>
+    <w:p>
+      <w:pPr>
+        <w:widowControl/>
+        <w:bidi w:val="1"/>
+        <w:spacing w:after="120" w:line="288" w:lineRule="auto"/>
+        <w:jc w:val="start"/>
+      </w:pPr>
+      <w:r>
+        <w:rPr>
+          <w:rFonts w:ascii="Vazirmatn" w:hAnsi="Vazirmatn" w:cs="Vazirmatn" w:eastAsia="Vazirmatn"/>
+          <w:b w:val="0"/>
+          <w:color w:val="000000"/>
+          <w:sz w:val="23"/>
+          <w:szCs w:val="23"/>
+          <w:rtl w:val="1"/>
+          <w:bCs w:val="0"/>
+          <w:lang w:val="en-US" w:bidi="fa-IR"/>
+        </w:rPr>
+        <w:t xml:space="preserve">در </w:t>
+      </w:r>
+      <w:r>
+        <w:rPr>
+          <w:rFonts w:ascii="Vazirmatn" w:hAnsi="Vazirmatn" w:cs="Vazirmatn" w:eastAsia="Vazirmatn"/>
+          <w:b w:val="0"/>
+          <w:color w:val="000000"/>
+          <w:sz w:val="23"/>
+          <w:szCs w:val="23"/>
+          <w:rtl w:val="0"/>
+          <w:bCs w:val="0"/>
+          <w:lang w:val="en-US" w:bidi="fa-IR"/>
+        </w:rPr>
+        <w:t xml:space="preserve">‎QGC‎</w:t>
       </w:r>
       <w:r>
         <w:rPr>
@@ -276,85 +334,7 @@
           <w:bCs w:val="0"/>
           <w:lang w:val="en-US" w:bidi="fa-IR"/>
         </w:rPr>
-        <w:t xml:space="preserve">بررسی و تأیید شده‌اند؛ گرفتن کنترل از </w:t>
-      </w:r>
-      <w:r>
-        <w:rPr>
-          <w:rFonts w:ascii="Vazirmatn" w:hAnsi="Vazirmatn" w:cs="Vazirmatn" w:eastAsia="Vazirmatn"/>
-          <w:b w:val="0"/>
-          <w:color w:val="000000"/>
-          <w:sz w:val="23"/>
-          <w:szCs w:val="23"/>
-          <w:rtl w:val="0"/>
-          <w:bCs w:val="0"/>
-          <w:lang w:val="en-US" w:bidi="fa-IR"/>
-        </w:rPr>
-        <w:t>‎MANUAL‎</w:t>
-      </w:r>
-      <w:r>
-        <w:rPr>
-          <w:rFonts w:ascii="Vazirmatn" w:hAnsi="Vazirmatn" w:cs="Vazirmatn" w:eastAsia="Vazirmatn"/>
-          <w:b w:val="0"/>
-          <w:color w:val="000000"/>
-          <w:sz w:val="23"/>
-          <w:szCs w:val="23"/>
-          <w:rtl w:val="1"/>
-          <w:bCs w:val="0"/>
-          <w:lang w:val="en-US" w:bidi="fa-IR"/>
-        </w:rPr>
-        <w:t xml:space="preserve"> </w:t>
-      </w:r>
-      <w:r>
-        <w:rPr>
-          <w:rFonts w:ascii="Vazirmatn" w:hAnsi="Vazirmatn" w:cs="Vazirmatn" w:eastAsia="Vazirmatn"/>
-          <w:b w:val="0"/>
-          <w:color w:val="000000"/>
-          <w:sz w:val="23"/>
-          <w:szCs w:val="23"/>
-          <w:rtl w:val="1"/>
-          <w:bCs w:val="0"/>
-          <w:lang w:val="en-US" w:bidi="fa-IR"/>
-        </w:rPr>
-        <w:t xml:space="preserve">و </w:t>
-      </w:r>
-      <w:r>
-        <w:rPr>
-          <w:rFonts w:ascii="Vazirmatn" w:hAnsi="Vazirmatn" w:cs="Vazirmatn" w:eastAsia="Vazirmatn"/>
-          <w:b w:val="0"/>
-          <w:color w:val="000000"/>
-          <w:sz w:val="23"/>
-          <w:szCs w:val="23"/>
-          <w:rtl w:val="0"/>
-          <w:bCs w:val="0"/>
-          <w:lang w:val="en-US" w:bidi="fa-IR"/>
-        </w:rPr>
-        <w:t>‎AUTO‎</w:t>
-      </w:r>
-      <w:r>
-        <w:rPr>
-          <w:rFonts w:ascii="Vazirmatn" w:hAnsi="Vazirmatn" w:cs="Vazirmatn" w:eastAsia="Vazirmatn"/>
-          <w:b w:val="0"/>
-          <w:color w:val="000000"/>
-          <w:sz w:val="23"/>
-          <w:szCs w:val="23"/>
-          <w:rtl w:val="1"/>
-          <w:bCs w:val="0"/>
-          <w:lang w:val="en-US" w:bidi="fa-IR"/>
-        </w:rPr>
-        <w:t xml:space="preserve"> </w:t>
-      </w:r>
-      <w:r>
-        <w:rPr>
-          <w:rFonts w:ascii="Vazirmatn" w:hAnsi="Vazirmatn" w:cs="Vazirmatn" w:eastAsia="Vazirmatn"/>
-          <w:b w:val="0"/>
-          <w:color w:val="000000"/>
-          <w:sz w:val="23"/>
-          <w:szCs w:val="23"/>
-          <w:rtl w:val="1"/>
-          <w:bCs w:val="0"/>
-          <w:lang w:val="en-US" w:bidi="fa-IR"/>
-        </w:rPr>
-        <w:t>دو پرواز جداست. چهارده آزمون رگرسیون نیز رفتار پرواز عادی و حفاظت‌های تکمیلی را پوشش داده‌اند. این نتایج مربوط به فریمور و مدل شبیه‌سازی همین بسته‌اند.</w:t>
+        <w:t xml:space="preserve">، حرکت گاز بدون تغییر مد، پاسخ خلبان شناخته نمی‌شد. بند ۴٫۴ تغییر مد را می‌خواهد؛ پذیرش حرکت عمدی استیک را اختیاری افزوده‌ایم. نمودار و بازپخش پنل نیز برای بررسی لاگِ بندهای ۵ و ۶ ساخته شده و الزام صریح سند نبوده‌اند.</w:t>
       </w:r>
     </w:p>
     <w:p>
@@ -520,7 +500,7 @@
                 <w:bCs w:val="0"/>
                 <w:lang w:val="en-US" w:bidi="fa-IR"/>
               </w:rPr>
-              <w:t>در حالت مسلح و در حال پرواز، شرایط سقوط را پایش می‌کند و مد عادی را نگه می‌دارد.</w:t>
+              <w:t xml:space="preserve">در پرواز مسلح، خطر را پایش می‌کند و مد جاری را نگه می‌دارد.</w:t>
             </w:r>
           </w:p>
         </w:tc>
@@ -592,7 +572,7 @@
                 <w:bCs w:val="0"/>
                 <w:lang w:val="en-US" w:bidi="fa-IR"/>
               </w:rPr>
-              <w:t>‎Home‎</w:t>
+              <w:t xml:space="preserve">‎Home‎ </w:t>
             </w:r>
             <w:r>
               <w:rPr>
@@ -605,20 +585,7 @@
                 <w:bCs w:val="0"/>
                 <w:lang w:val="en-US" w:bidi="fa-IR"/>
               </w:rPr>
-              <w:t xml:space="preserve"> </w:t>
-            </w:r>
-            <w:r>
-              <w:rPr>
-                <w:rFonts w:ascii="Vazirmatn" w:hAnsi="Vazirmatn" w:cs="Vazirmatn" w:eastAsia="Vazirmatn"/>
-                <w:b w:val="0"/>
-                <w:color w:val="000000"/>
-                <w:sz w:val="20"/>
-                <w:szCs w:val="21"/>
-                <w:rtl w:val="1"/>
-                <w:bCs w:val="0"/>
-                <w:lang w:val="en-US" w:bidi="fa-IR"/>
-              </w:rPr>
-              <w:t>با خطر تأییدشده، حدود هر ثانیه هشدار می‌فرستد؛ مد عوض نمی‌شود.</w:t>
+              <w:t xml:space="preserve">با خطر تأییدشده، تقریباً هر ثانیه هشدار می‌دهد.</w:t>
             </w:r>
           </w:p>
         </w:tc>
@@ -677,7 +644,7 @@
                 <w:bCs w:val="0"/>
                 <w:lang w:val="en-US" w:bidi="fa-IR"/>
               </w:rPr>
-              <w:t xml:space="preserve">زیر ۱۰۰ متر با ادامه سقوط، کنترل را می‌گیرد؛ </w:t>
+              <w:t xml:space="preserve">زیر ۱۰۰ متر با ادامه خطر، کنترل را می‌گیرد و با </w:t>
             </w:r>
             <w:r>
               <w:rPr>
@@ -690,7 +657,7 @@
                 <w:bCs w:val="0"/>
                 <w:lang w:val="en-US" w:bidi="fa-IR"/>
               </w:rPr>
-              <w:t>‎TECS‎</w:t>
+              <w:t xml:space="preserve">‎TECS‎ </w:t>
             </w:r>
             <w:r>
               <w:rPr>
@@ -703,20 +670,7 @@
                 <w:bCs w:val="0"/>
                 <w:lang w:val="en-US" w:bidi="fa-IR"/>
               </w:rPr>
-              <w:t xml:space="preserve"> </w:t>
-            </w:r>
-            <w:r>
-              <w:rPr>
-                <w:rFonts w:ascii="Vazirmatn" w:hAnsi="Vazirmatn" w:cs="Vazirmatn" w:eastAsia="Vazirmatn"/>
-                <w:b w:val="0"/>
-                <w:color w:val="000000"/>
-                <w:sz w:val="20"/>
-                <w:szCs w:val="21"/>
-                <w:rtl w:val="1"/>
-                <w:bCs w:val="0"/>
-                <w:lang w:val="en-US" w:bidi="fa-IR"/>
-              </w:rPr>
-              <w:t>بازیابی تا ۲۰۰ متر را با رعایت سرعت مدیریت می‌کند.</w:t>
+              <w:t xml:space="preserve">تا ۲۰۰ متر بازیابی می‌کند.</w:t>
             </w:r>
           </w:p>
         </w:tc>
@@ -775,7 +729,7 @@
                 <w:bCs w:val="0"/>
                 <w:lang w:val="en-US" w:bidi="fa-IR"/>
               </w:rPr>
-              <w:t>پس از دو ثانیه پایداری پیوسته، پیام تثبیت را می‌فرستد و مهلت پنج‌ثانیه‌ای خلبان را آغاز می‌کند.</w:t>
+              <w:t xml:space="preserve">پس از دو ثانیه پایداری، پیام تثبیت و مهلت پنج‌ثانیه‌ای خلبان آغاز می‌شود.</w:t>
             </w:r>
           </w:p>
         </w:tc>
@@ -834,7 +788,7 @@
                 <w:bCs w:val="0"/>
                 <w:lang w:val="en-US" w:bidi="fa-IR"/>
               </w:rPr>
-              <w:t xml:space="preserve">تغییر مد معتبر خلبان را می‌پذیرد؛ پاسخ عمدی با استیک نیز در مسیر اختیاری، </w:t>
+              <w:t xml:space="preserve">تغییر مد معتبر را می‌پذیرد؛ پاسخ اختیاری با استیک، </w:t>
             </w:r>
             <w:r>
               <w:rPr>
@@ -847,7 +801,7 @@
                 <w:bCs w:val="0"/>
                 <w:lang w:val="en-US" w:bidi="fa-IR"/>
               </w:rPr>
-              <w:t>‎FBWA‎</w:t>
+              <w:t xml:space="preserve">‎FBWA‎ </w:t>
             </w:r>
             <w:r>
               <w:rPr>
@@ -860,20 +814,7 @@
                 <w:bCs w:val="0"/>
                 <w:lang w:val="en-US" w:bidi="fa-IR"/>
               </w:rPr>
-              <w:t xml:space="preserve"> </w:t>
-            </w:r>
-            <w:r>
-              <w:rPr>
-                <w:rFonts w:ascii="Vazirmatn" w:hAnsi="Vazirmatn" w:cs="Vazirmatn" w:eastAsia="Vazirmatn"/>
-                <w:b w:val="0"/>
-                <w:color w:val="000000"/>
-                <w:sz w:val="20"/>
-                <w:szCs w:val="21"/>
-                <w:rtl w:val="1"/>
-                <w:bCs w:val="0"/>
-                <w:lang w:val="en-US" w:bidi="fa-IR"/>
-              </w:rPr>
-              <w:t>را انتخاب می‌کند.</w:t>
+              <w:t xml:space="preserve">را انتخاب می‌کند.</w:t>
             </w:r>
           </w:p>
         </w:tc>
@@ -932,7 +873,7 @@
                 <w:bCs w:val="0"/>
                 <w:lang w:val="en-US" w:bidi="fa-IR"/>
               </w:rPr>
-              <w:t xml:space="preserve">بی‌پاسخ‌ماندن خلبان یا شکست بازیابی، درخواست </w:t>
+              <w:t xml:space="preserve">بدون پاسخ یا با شکست بازیابی: درخواست </w:t>
             </w:r>
             <w:r>
               <w:rPr>
@@ -945,7 +886,7 @@
                 <w:bCs w:val="0"/>
                 <w:lang w:val="en-US" w:bidi="fa-IR"/>
               </w:rPr>
-              <w:t>‎AP_Parachute‎</w:t>
+              <w:t xml:space="preserve">‎AP_Parachute‎</w:t>
             </w:r>
             <w:r>
               <w:rPr>
@@ -971,33 +912,7 @@
                 <w:bCs w:val="0"/>
                 <w:lang w:val="en-US" w:bidi="fa-IR"/>
               </w:rPr>
-              <w:t>‎disarm‎</w:t>
-            </w:r>
-            <w:r>
-              <w:rPr>
-                <w:rFonts w:ascii="Vazirmatn" w:hAnsi="Vazirmatn" w:cs="Vazirmatn" w:eastAsia="Vazirmatn"/>
-                <w:b w:val="0"/>
-                <w:color w:val="000000"/>
-                <w:sz w:val="20"/>
-                <w:szCs w:val="21"/>
-                <w:rtl w:val="1"/>
-                <w:bCs w:val="0"/>
-                <w:lang w:val="en-US" w:bidi="fa-IR"/>
-              </w:rPr>
-              <w:t xml:space="preserve"> </w:t>
-            </w:r>
-            <w:r>
-              <w:rPr>
-                <w:rFonts w:ascii="Vazirmatn" w:hAnsi="Vazirmatn" w:cs="Vazirmatn" w:eastAsia="Vazirmatn"/>
-                <w:b w:val="0"/>
-                <w:color w:val="000000"/>
-                <w:sz w:val="20"/>
-                <w:szCs w:val="21"/>
-                <w:rtl w:val="1"/>
-                <w:bCs w:val="0"/>
-                <w:lang w:val="en-US" w:bidi="fa-IR"/>
-              </w:rPr>
-              <w:t>را به‌دنبال دارد.</w:t>
+              <w:t xml:space="preserve">‎disarm.‎</w:t>
             </w:r>
           </w:p>
         </w:tc>
@@ -1007,204 +922,6 @@
       <w:pPr>
         <w:spacing w:after="20" w:before="0" w:line="60" w:lineRule="exact"/>
       </w:pPr>
-    </w:p>
-    <w:p>
-      <w:pPr>
-        <w:widowControl/>
-        <w:bidi w:val="1"/>
-        <w:spacing w:after="120" w:line="288" w:lineRule="auto"/>
-        <w:jc w:val="start"/>
-      </w:pPr>
-      <w:r>
-        <w:rPr>
-          <w:rFonts w:ascii="Vazirmatn" w:hAnsi="Vazirmatn" w:cs="Vazirmatn" w:eastAsia="Vazirmatn"/>
-          <w:b w:val="0"/>
-          <w:color w:val="000000"/>
-          <w:sz w:val="23"/>
-          <w:szCs w:val="23"/>
-          <w:rtl w:val="1"/>
-          <w:bCs w:val="0"/>
-          <w:lang w:val="en-US" w:bidi="fa-IR"/>
-        </w:rPr>
-        <w:t xml:space="preserve">پنج پارامتر تعیین‌شده در سند و کنترل بازیابی با </w:t>
-      </w:r>
-      <w:r>
-        <w:rPr>
-          <w:rFonts w:ascii="Vazirmatn" w:hAnsi="Vazirmatn" w:cs="Vazirmatn" w:eastAsia="Vazirmatn"/>
-          <w:b w:val="0"/>
-          <w:color w:val="000000"/>
-          <w:sz w:val="23"/>
-          <w:szCs w:val="23"/>
-          <w:rtl w:val="0"/>
-          <w:bCs w:val="0"/>
-          <w:lang w:val="en-US" w:bidi="fa-IR"/>
-        </w:rPr>
-        <w:t>‎TECS‎</w:t>
-      </w:r>
-      <w:r>
-        <w:rPr>
-          <w:rFonts w:ascii="Vazirmatn" w:hAnsi="Vazirmatn" w:cs="Vazirmatn" w:eastAsia="Vazirmatn"/>
-          <w:b w:val="0"/>
-          <w:color w:val="000000"/>
-          <w:sz w:val="23"/>
-          <w:szCs w:val="23"/>
-          <w:rtl w:val="1"/>
-          <w:bCs w:val="0"/>
-          <w:lang w:val="en-US" w:bidi="fa-IR"/>
-        </w:rPr>
-        <w:t xml:space="preserve"> </w:t>
-      </w:r>
-      <w:r>
-        <w:rPr>
-          <w:rFonts w:ascii="Vazirmatn" w:hAnsi="Vazirmatn" w:cs="Vazirmatn" w:eastAsia="Vazirmatn"/>
-          <w:b w:val="0"/>
-          <w:color w:val="000000"/>
-          <w:sz w:val="23"/>
-          <w:szCs w:val="23"/>
-          <w:rtl w:val="1"/>
-          <w:bCs w:val="0"/>
-          <w:lang w:val="en-US" w:bidi="fa-IR"/>
-        </w:rPr>
-        <w:t>حفظ شده‌اند. برای جلوگیری از هشدار کاذب، پایداری شرط سقوط را تعریف کرده‌ایم. همچنین حفاظت نزول خطرناک با سرعت تقریباً ثابت و پاسخ اختیاری با استیک را افزوده‌ایم؛ این دو رفتار از شرط صرفاً شتابی و تغییر مدِ سند گسترده‌ترند و در بخش چهار مشخص شده‌اند.</w:t>
-      </w:r>
-    </w:p>
-    <w:p>
-      <w:pPr>
-        <w:widowControl/>
-        <w:bidi w:val="1"/>
-        <w:spacing w:after="120" w:line="288" w:lineRule="auto"/>
-        <w:jc w:val="start"/>
-      </w:pPr>
-      <w:r>
-        <w:rPr>
-          <w:rFonts w:ascii="Vazirmatn" w:hAnsi="Vazirmatn" w:cs="Vazirmatn" w:eastAsia="Vazirmatn"/>
-          <w:b w:val="0"/>
-          <w:color w:val="000000"/>
-          <w:sz w:val="23"/>
-          <w:szCs w:val="23"/>
-          <w:rtl w:val="1"/>
-          <w:bCs w:val="0"/>
-          <w:lang w:val="en-US" w:bidi="fa-IR"/>
-        </w:rPr>
-        <w:t xml:space="preserve">ارتفاع تصمیم‌گیری نسبت به </w:t>
-      </w:r>
-      <w:r>
-        <w:rPr>
-          <w:rFonts w:ascii="Vazirmatn" w:hAnsi="Vazirmatn" w:cs="Vazirmatn" w:eastAsia="Vazirmatn"/>
-          <w:b w:val="0"/>
-          <w:color w:val="000000"/>
-          <w:sz w:val="23"/>
-          <w:szCs w:val="23"/>
-          <w:rtl w:val="0"/>
-          <w:bCs w:val="0"/>
-          <w:lang w:val="en-US" w:bidi="fa-IR"/>
-        </w:rPr>
-        <w:t>‎Home‎</w:t>
-      </w:r>
-      <w:r>
-        <w:rPr>
-          <w:rFonts w:ascii="Vazirmatn" w:hAnsi="Vazirmatn" w:cs="Vazirmatn" w:eastAsia="Vazirmatn"/>
-          <w:b w:val="0"/>
-          <w:color w:val="000000"/>
-          <w:sz w:val="23"/>
-          <w:szCs w:val="23"/>
-          <w:rtl w:val="1"/>
-          <w:bCs w:val="0"/>
-          <w:lang w:val="en-US" w:bidi="fa-IR"/>
-        </w:rPr>
-        <w:t xml:space="preserve"> </w:t>
-      </w:r>
-      <w:r>
-        <w:rPr>
-          <w:rFonts w:ascii="Vazirmatn" w:hAnsi="Vazirmatn" w:cs="Vazirmatn" w:eastAsia="Vazirmatn"/>
-          <w:b w:val="0"/>
-          <w:color w:val="000000"/>
-          <w:sz w:val="23"/>
-          <w:szCs w:val="23"/>
-          <w:rtl w:val="1"/>
-          <w:bCs w:val="0"/>
-          <w:lang w:val="en-US" w:bidi="fa-IR"/>
-        </w:rPr>
-        <w:t xml:space="preserve">است. فاصله از زمینِ مدل در پنل جدا نمایش داده می‌شود؛ این دو مرجع یکسان نیستند. بسته حاضر باینری </w:t>
-      </w:r>
-      <w:r>
-        <w:rPr>
-          <w:rFonts w:ascii="Vazirmatn" w:hAnsi="Vazirmatn" w:cs="Vazirmatn" w:eastAsia="Vazirmatn"/>
-          <w:b w:val="0"/>
-          <w:color w:val="000000"/>
-          <w:sz w:val="23"/>
-          <w:szCs w:val="23"/>
-          <w:rtl w:val="0"/>
-          <w:bCs w:val="0"/>
-          <w:lang w:val="en-US" w:bidi="fa-IR"/>
-        </w:rPr>
-        <w:t>‎SITL‎</w:t>
-      </w:r>
-      <w:r>
-        <w:rPr>
-          <w:rFonts w:ascii="Vazirmatn" w:hAnsi="Vazirmatn" w:cs="Vazirmatn" w:eastAsia="Vazirmatn"/>
-          <w:b w:val="0"/>
-          <w:color w:val="000000"/>
-          <w:sz w:val="23"/>
-          <w:szCs w:val="23"/>
-          <w:rtl w:val="1"/>
-          <w:bCs w:val="0"/>
-          <w:lang w:val="en-US" w:bidi="fa-IR"/>
-        </w:rPr>
-        <w:t xml:space="preserve"> </w:t>
-      </w:r>
-      <w:r>
-        <w:rPr>
-          <w:rFonts w:ascii="Vazirmatn" w:hAnsi="Vazirmatn" w:cs="Vazirmatn" w:eastAsia="Vazirmatn"/>
-          <w:b w:val="0"/>
-          <w:color w:val="000000"/>
-          <w:sz w:val="23"/>
-          <w:szCs w:val="23"/>
-          <w:rtl w:val="1"/>
-          <w:bCs w:val="0"/>
-          <w:lang w:val="en-US" w:bidi="fa-IR"/>
-        </w:rPr>
-        <w:t xml:space="preserve">رایانه است و فایل فلش یا تأیید پرواز واقعی </w:t>
-      </w:r>
-      <w:r>
-        <w:rPr>
-          <w:rFonts w:ascii="Vazirmatn" w:hAnsi="Vazirmatn" w:cs="Vazirmatn" w:eastAsia="Vazirmatn"/>
-          <w:b w:val="0"/>
-          <w:color w:val="000000"/>
-          <w:sz w:val="23"/>
-          <w:szCs w:val="23"/>
-          <w:rtl w:val="0"/>
-          <w:bCs w:val="0"/>
-          <w:lang w:val="en-US" w:bidi="fa-IR"/>
-        </w:rPr>
-        <w:t>‎Pixhawk‎</w:t>
-      </w:r>
-      <w:r>
-        <w:rPr>
-          <w:rFonts w:ascii="Vazirmatn" w:hAnsi="Vazirmatn" w:cs="Vazirmatn" w:eastAsia="Vazirmatn"/>
-          <w:b w:val="0"/>
-          <w:color w:val="000000"/>
-          <w:sz w:val="23"/>
-          <w:szCs w:val="23"/>
-          <w:rtl w:val="1"/>
-          <w:bCs w:val="0"/>
-          <w:lang w:val="en-US" w:bidi="fa-IR"/>
-        </w:rPr>
-        <w:t xml:space="preserve"> </w:t>
-      </w:r>
-      <w:r>
-        <w:rPr>
-          <w:rFonts w:ascii="Vazirmatn" w:hAnsi="Vazirmatn" w:cs="Vazirmatn" w:eastAsia="Vazirmatn"/>
-          <w:b w:val="0"/>
-          <w:color w:val="000000"/>
-          <w:sz w:val="23"/>
-          <w:szCs w:val="23"/>
-          <w:rtl w:val="1"/>
-          <w:bCs w:val="0"/>
-          <w:lang w:val="en-US" w:bidi="fa-IR"/>
-        </w:rPr>
-        <w:t>نیست.</w:t>
-      </w:r>
     </w:p>
     <w:p>
       <w:r>
@@ -1265,7 +982,7 @@
           <w:bCs w:val="0"/>
           <w:lang w:val="en-US" w:bidi="fa-IR"/>
         </w:rPr>
-        <w:t>‎RSC‎</w:t>
+        <w:t xml:space="preserve">‎RSC‎ </w:t>
       </w:r>
       <w:r>
         <w:rPr>
@@ -1278,7 +995,20 @@
           <w:bCs w:val="0"/>
           <w:lang w:val="en-US" w:bidi="fa-IR"/>
         </w:rPr>
-        <w:t xml:space="preserve"> </w:t>
+        <w:t xml:space="preserve">ساخته‌ایم: پنج پارامتر خواسته‌شده در سند و ۲۱ تنظیم تکمیلی. جدول‌ها فقط همین پارامترها را نشان می‌دهند. مقدارها همان مقادیر آزموده‌شده‌اند؛ </w:t>
+      </w:r>
+      <w:r>
+        <w:rPr>
+          <w:rFonts w:ascii="Vazirmatn" w:hAnsi="Vazirmatn" w:cs="Vazirmatn" w:eastAsia="Vazirmatn"/>
+          <w:b w:val="0"/>
+          <w:color w:val="000000"/>
+          <w:sz w:val="23"/>
+          <w:szCs w:val="23"/>
+          <w:rtl w:val="0"/>
+          <w:bCs w:val="0"/>
+          <w:lang w:val="en-US" w:bidi="fa-IR"/>
+        </w:rPr>
+        <w:t xml:space="preserve">‎RSC_ENABLE‎ </w:t>
       </w:r>
       <w:r>
         <w:rPr>
@@ -1291,46 +1021,7 @@
           <w:bCs w:val="0"/>
           <w:lang w:val="en-US" w:bidi="fa-IR"/>
         </w:rPr>
-        <w:t xml:space="preserve">افزوده‌ایم: پنج پارامتر مشخص‌شده در تکلیف و ۲۱ تنظیم تکمیلی. جدول فقط همین پارامترهای افزوده‌شده را دارد. مقدارها مربوط به پروفایل آزموده‌شده‌اند؛ استثنای پیش‌فرض خاموش </w:t>
-      </w:r>
-      <w:r>
-        <w:rPr>
-          <w:rFonts w:ascii="Vazirmatn" w:hAnsi="Vazirmatn" w:cs="Vazirmatn" w:eastAsia="Vazirmatn"/>
-          <w:b w:val="0"/>
-          <w:color w:val="000000"/>
-          <w:sz w:val="23"/>
-          <w:szCs w:val="23"/>
-          <w:rtl w:val="0"/>
-          <w:bCs w:val="0"/>
-          <w:lang w:val="en-US" w:bidi="fa-IR"/>
-        </w:rPr>
-        <w:t>‎RSC_ENABLE‎</w:t>
-      </w:r>
-      <w:r>
-        <w:rPr>
-          <w:rFonts w:ascii="Vazirmatn" w:hAnsi="Vazirmatn" w:cs="Vazirmatn" w:eastAsia="Vazirmatn"/>
-          <w:b w:val="0"/>
-          <w:color w:val="000000"/>
-          <w:sz w:val="23"/>
-          <w:szCs w:val="23"/>
-          <w:rtl w:val="1"/>
-          <w:bCs w:val="0"/>
-          <w:lang w:val="en-US" w:bidi="fa-IR"/>
-        </w:rPr>
-        <w:t xml:space="preserve"> </w:t>
-      </w:r>
-      <w:r>
-        <w:rPr>
-          <w:rFonts w:ascii="Vazirmatn" w:hAnsi="Vazirmatn" w:cs="Vazirmatn" w:eastAsia="Vazirmatn"/>
-          <w:b w:val="0"/>
-          <w:color w:val="000000"/>
-          <w:sz w:val="23"/>
-          <w:szCs w:val="23"/>
-          <w:rtl w:val="1"/>
-          <w:bCs w:val="0"/>
-          <w:lang w:val="en-US" w:bidi="fa-IR"/>
-        </w:rPr>
-        <w:t>در سطر اول مشخص است.</w:t>
+        <w:t xml:space="preserve">در فریمور به‌طور پیش‌فرض صفر است و برای آزمون روی یک قرار می‌گیرد.</w:t>
       </w:r>
     </w:p>
     <w:tbl>
@@ -2654,7 +2345,7 @@
           <w:bCs w:val="0"/>
           <w:lang w:val="en-US" w:bidi="fa-IR"/>
         </w:rPr>
-        <w:t xml:space="preserve">پنج سطر اول خواسته مستقیم سند هستند. تنظیمات تکمیلی، تداوم خطر، هیسترزیس و تعریف عددی پایداری را قابل بررسی می‌کنند. نقش </w:t>
+        <w:t xml:space="preserve">پنج سطر اول، خواسته مستقیم سند هستند. بقیه، مدت ادامه خطر، حاشیه پاک‌شدن هشدار و شرایط پایداری را مشخص می‌کنند. </w:t>
       </w:r>
       <w:r>
         <w:rPr>
@@ -2667,20 +2358,7 @@
           <w:bCs w:val="0"/>
           <w:lang w:val="en-US" w:bidi="fa-IR"/>
         </w:rPr>
-        <w:t>‎RSC_SINK‎</w:t>
-      </w:r>
-      <w:r>
-        <w:rPr>
-          <w:rFonts w:ascii="Vazirmatn" w:hAnsi="Vazirmatn" w:cs="Vazirmatn" w:eastAsia="Vazirmatn"/>
-          <w:b w:val="0"/>
-          <w:color w:val="000000"/>
-          <w:sz w:val="23"/>
-          <w:szCs w:val="23"/>
-          <w:rtl w:val="1"/>
-          <w:bCs w:val="0"/>
-          <w:lang w:val="en-US" w:bidi="fa-IR"/>
-        </w:rPr>
-        <w:t xml:space="preserve"> </w:t>
+        <w:t xml:space="preserve">‎RSC_SINK‎ </w:t>
       </w:r>
       <w:r>
         <w:rPr>
@@ -2706,7 +2384,7 @@
           <w:bCs w:val="0"/>
           <w:lang w:val="en-US" w:bidi="fa-IR"/>
         </w:rPr>
-        <w:t>‎RSC_TTC_S‎</w:t>
+        <w:t xml:space="preserve">‎RSC_TTC_S‎ </w:t>
       </w:r>
       <w:r>
         <w:rPr>
@@ -2719,20 +2397,7 @@
           <w:bCs w:val="0"/>
           <w:lang w:val="en-US" w:bidi="fa-IR"/>
         </w:rPr>
-        <w:t xml:space="preserve"> </w:t>
-      </w:r>
-      <w:r>
-        <w:rPr>
-          <w:rFonts w:ascii="Vazirmatn" w:hAnsi="Vazirmatn" w:cs="Vazirmatn" w:eastAsia="Vazirmatn"/>
-          <w:b w:val="0"/>
-          <w:color w:val="000000"/>
-          <w:sz w:val="23"/>
-          <w:szCs w:val="23"/>
-          <w:rtl w:val="1"/>
-          <w:bCs w:val="0"/>
-          <w:lang w:val="en-US" w:bidi="fa-IR"/>
-        </w:rPr>
-        <w:t>محدود به مسیر تکمیلی تشخیص نزول خطرناک است؛ زاویه یا چرخش به‌تنهایی گرفتن کنترل را فعال نمی‌کند.</w:t>
+        <w:t xml:space="preserve">برای حفاظت تکمیلی نزول خطرناک‌اند. زاویه زیاد یا چرخش، به‌تنهایی باعث گرفتن کنترل نمی‌شود.</w:t>
       </w:r>
     </w:p>
     <w:p>
@@ -4071,7 +3736,7 @@
           <w:bCs w:val="0"/>
           <w:lang w:val="en-US" w:bidi="fa-IR"/>
         </w:rPr>
-        <w:t xml:space="preserve">سند افزودن تنظیمات ضروری را همراه با توجیه در </w:t>
+        <w:t xml:space="preserve">بند ۳ سند، افزودن تنظیمات ضروری را با توضیح در </w:t>
       </w:r>
       <w:r>
         <w:rPr>
@@ -4084,7 +3749,7 @@
           <w:bCs w:val="0"/>
           <w:lang w:val="en-US" w:bidi="fa-IR"/>
         </w:rPr>
-        <w:t>‎README‎</w:t>
+        <w:t xml:space="preserve">‎README‎ </w:t>
       </w:r>
       <w:r>
         <w:rPr>
@@ -4097,20 +3762,7 @@
           <w:bCs w:val="0"/>
           <w:lang w:val="en-US" w:bidi="fa-IR"/>
         </w:rPr>
-        <w:t xml:space="preserve"> </w:t>
-      </w:r>
-      <w:r>
-        <w:rPr>
-          <w:rFonts w:ascii="Vazirmatn" w:hAnsi="Vazirmatn" w:cs="Vazirmatn" w:eastAsia="Vazirmatn"/>
-          <w:b w:val="0"/>
-          <w:color w:val="000000"/>
-          <w:sz w:val="23"/>
-          <w:szCs w:val="23"/>
-          <w:rtl w:val="1"/>
-          <w:bCs w:val="0"/>
-          <w:lang w:val="en-US" w:bidi="fa-IR"/>
-        </w:rPr>
-        <w:t>مجاز دانسته است. این ۲۱ تنظیم، ابهام‌های «پایدار»، «ادامه سقوط»، «ناتوانی در اوج‌گیری» و «واکنش خلبان» را به حدود قابل آزمون تبدیل می‌کنند. در استفاده عادی، پنج پارامتر اصلی نقطه شروع‌اند و تنظیمات تکمیلی با مقادیر مهندسیِ آزموده‌شده باقی می‌مانند.</w:t>
+        <w:t xml:space="preserve">مجاز می‌داند. این ۲۱ تنظیم مشخص می‌کنند خطر چه مدت باید ادامه پیدا کند، پرواز چه زمانی پایدار است و بازیابی چه زمانی شکست خورده است. در شروع کار، پنج پارامتر اصلی تنظیم می‌شوند؛ مقادیر تکمیلی بر اساس آزمون مدل حاضر انتخاب شده‌اند.</w:t>
       </w:r>
     </w:p>
     <w:p>
@@ -4131,7 +3783,7 @@
           <w:bCs w:val="0"/>
           <w:lang w:val="en-US" w:bidi="fa-IR"/>
         </w:rPr>
-        <w:t xml:space="preserve">گاز کامل معیار اوج‌گیری نیست. پنجره پیشرفت، هم افزایش ارتفاع و هم افزایش انرژی ناشی از سرعت هوایی را می‌پذیرد؛ بنابراین زمانی که پرنده برای خروج از وضعیت کم‌سرعت انرژی می‌گیرد، صرفاً به‌دلیل اوج‌نگرفتن لحظه‌ای شکست اعلام نمی‌شود. تنظیمات موجود </w:t>
+        <w:t xml:space="preserve">بازبودن کامل گاز، به‌تنهایی نشان نمی‌دهد که پرنده در حال اوج‌گیری است. ممکن است ابتدا سرعت بگیرد و بعد بالا برود. به همین دلیل، در بررسی پیشرفت، هم افزایش ارتفاع و هم افزایش انرژی ناشی از سرعت هوایی را می‌پذیریم. تنظیمات استاندارد </w:t>
       </w:r>
       <w:r>
         <w:rPr>
@@ -4144,7 +3796,7 @@
           <w:bCs w:val="0"/>
           <w:lang w:val="en-US" w:bidi="fa-IR"/>
         </w:rPr>
-        <w:t>‎TECS‎</w:t>
+        <w:t xml:space="preserve">‎TECS‎</w:t>
       </w:r>
       <w:r>
         <w:rPr>
@@ -4157,7 +3809,7 @@
           <w:bCs w:val="0"/>
           <w:lang w:val="en-US" w:bidi="fa-IR"/>
         </w:rPr>
-        <w:t>، حداقل سرعت و چتر در فایل کامل پارامترها آمده‌اند، اما پارامتر افزوده ما محسوب نمی‌شوند.</w:t>
+        <w:t xml:space="preserve">، حداقل سرعت و چتر هم در فایل کامل پارامترها هستند، اما جزو پارامترهای ساخته‌شده ما نیستند.</w:t>
       </w:r>
     </w:p>
     <w:p>
@@ -4229,7 +3881,7 @@
           <w:bCs w:val="0"/>
           <w:lang w:val="en-US" w:bidi="fa-IR"/>
         </w:rPr>
-        <w:t>ناظر با نرخ ۵۰ هرتز، شتاب عمودی رو به پایین در دستگاه زمین را پس از حذف گرانش و فیلتر ۵ هرتز بررسی می‌کند. شتاب خام بدنه یا شتاب رو به بالا در تیک‌آف، معادل سقوط فرض نمی‌شود. برای تأیید نزول، سرعت رو به پایین باید بیش از ۰٫۵ متر بر ثانیه، حداقل یک ثانیه پیوسته برقرار باشد و دست‌کم دو متر افت ارتفاع اندازه‌گیری شود.</w:t>
+        <w:t xml:space="preserve">ناظر، ۵۰ بار در ثانیه شتاب عمودی رو به پایین را در دستگاه مختصات زمین بررسی می‌کند. اثر گرانش حذف می‌شود و یک فیلتر ۵ هرتزی، تغییرهای سریع سیگنال را کاهش می‌دهد. بنابراین شتاب خام بدنه یا شتاب رو به بالای تیک‌آف، مستقیماً نشانه سقوط نیست. برای تأیید نزول، سرعت رو به پایین باید بیش از ۰٫۵ متر بر ثانیه باشد، حداقل یک ثانیه ادامه یابد و دست‌کم دو متر افت ارتفاع اندازه‌گیری شود.</w:t>
       </w:r>
     </w:p>
     <w:p>
@@ -4250,7 +3902,7 @@
           <w:bCs w:val="0"/>
           <w:lang w:val="en-US" w:bidi="fa-IR"/>
         </w:rPr>
-        <w:t xml:space="preserve">پس از این تأیید، عبور شتاب نزولی از </w:t>
+        <w:t xml:space="preserve">پس از تأیید نزول، شتاب نزولی باید بیشتر از </w:t>
       </w:r>
       <w:r>
         <w:rPr>
@@ -4263,7 +3915,7 @@
           <w:bCs w:val="0"/>
           <w:lang w:val="en-US" w:bidi="fa-IR"/>
         </w:rPr>
-        <w:t>‎RSC_ACC_Z‎</w:t>
+        <w:t xml:space="preserve">‎RSC_ACC_Z‎ </w:t>
       </w:r>
       <w:r>
         <w:rPr>
@@ -4276,7 +3928,20 @@
           <w:bCs w:val="0"/>
           <w:lang w:val="en-US" w:bidi="fa-IR"/>
         </w:rPr>
-        <w:t xml:space="preserve"> </w:t>
+        <w:t xml:space="preserve">شود و به‌اندازه </w:t>
+      </w:r>
+      <w:r>
+        <w:rPr>
+          <w:rFonts w:ascii="Vazirmatn" w:hAnsi="Vazirmatn" w:cs="Vazirmatn" w:eastAsia="Vazirmatn"/>
+          <w:b w:val="0"/>
+          <w:color w:val="000000"/>
+          <w:sz w:val="23"/>
+          <w:szCs w:val="23"/>
+          <w:rtl w:val="0"/>
+          <w:bCs w:val="0"/>
+          <w:lang w:val="en-US" w:bidi="fa-IR"/>
+        </w:rPr>
+        <w:t xml:space="preserve">‎RSC_DWELL_S‎ </w:t>
       </w:r>
       <w:r>
         <w:rPr>
@@ -4289,7 +3954,7 @@
           <w:bCs w:val="0"/>
           <w:lang w:val="en-US" w:bidi="fa-IR"/>
         </w:rPr>
-        <w:t xml:space="preserve">به‌مدت </w:t>
+        <w:t xml:space="preserve">ادامه یابد. اگر ارتفاع زیر </w:t>
       </w:r>
       <w:r>
         <w:rPr>
@@ -4302,7 +3967,7 @@
           <w:bCs w:val="0"/>
           <w:lang w:val="en-US" w:bidi="fa-IR"/>
         </w:rPr>
-        <w:t>‎RSC_DWELL_S‎</w:t>
+        <w:t xml:space="preserve">‎RSC_ALT_WARN‎ </w:t>
       </w:r>
       <w:r>
         <w:rPr>
@@ -4315,7 +3980,20 @@
           <w:bCs w:val="0"/>
           <w:lang w:val="en-US" w:bidi="fa-IR"/>
         </w:rPr>
-        <w:t xml:space="preserve"> </w:t>
+        <w:t xml:space="preserve">باشد، هشدار </w:t>
+      </w:r>
+      <w:r>
+        <w:rPr>
+          <w:rFonts w:ascii="Vazirmatn" w:hAnsi="Vazirmatn" w:cs="Vazirmatn" w:eastAsia="Vazirmatn"/>
+          <w:b w:val="0"/>
+          <w:color w:val="000000"/>
+          <w:sz w:val="23"/>
+          <w:szCs w:val="23"/>
+          <w:rtl w:val="0"/>
+          <w:bCs w:val="0"/>
+          <w:lang w:val="en-US" w:bidi="fa-IR"/>
+        </w:rPr>
+        <w:t xml:space="preserve">‎WARNING‎ </w:t>
       </w:r>
       <w:r>
         <w:rPr>
@@ -4328,72 +4006,7 @@
           <w:bCs w:val="0"/>
           <w:lang w:val="en-US" w:bidi="fa-IR"/>
         </w:rPr>
-        <w:t xml:space="preserve">شرط اصلی سقوط را کامل می‌کند. زیر </w:t>
-      </w:r>
-      <w:r>
-        <w:rPr>
-          <w:rFonts w:ascii="Vazirmatn" w:hAnsi="Vazirmatn" w:cs="Vazirmatn" w:eastAsia="Vazirmatn"/>
-          <w:b w:val="0"/>
-          <w:color w:val="000000"/>
-          <w:sz w:val="23"/>
-          <w:szCs w:val="23"/>
-          <w:rtl w:val="0"/>
-          <w:bCs w:val="0"/>
-          <w:lang w:val="en-US" w:bidi="fa-IR"/>
-        </w:rPr>
-        <w:t>‎RSC_ALT_WARN‎</w:t>
-      </w:r>
-      <w:r>
-        <w:rPr>
-          <w:rFonts w:ascii="Vazirmatn" w:hAnsi="Vazirmatn" w:cs="Vazirmatn" w:eastAsia="Vazirmatn"/>
-          <w:b w:val="0"/>
-          <w:color w:val="000000"/>
-          <w:sz w:val="23"/>
-          <w:szCs w:val="23"/>
-          <w:rtl w:val="1"/>
-          <w:bCs w:val="0"/>
-          <w:lang w:val="en-US" w:bidi="fa-IR"/>
-        </w:rPr>
-        <w:t xml:space="preserve">، پیام با شدت </w:t>
-      </w:r>
-      <w:r>
-        <w:rPr>
-          <w:rFonts w:ascii="Vazirmatn" w:hAnsi="Vazirmatn" w:cs="Vazirmatn" w:eastAsia="Vazirmatn"/>
-          <w:b w:val="0"/>
-          <w:color w:val="000000"/>
-          <w:sz w:val="23"/>
-          <w:szCs w:val="23"/>
-          <w:rtl w:val="0"/>
-          <w:bCs w:val="0"/>
-          <w:lang w:val="en-US" w:bidi="fa-IR"/>
-        </w:rPr>
-        <w:t>‎WARNING‎</w:t>
-      </w:r>
-      <w:r>
-        <w:rPr>
-          <w:rFonts w:ascii="Vazirmatn" w:hAnsi="Vazirmatn" w:cs="Vazirmatn" w:eastAsia="Vazirmatn"/>
-          <w:b w:val="0"/>
-          <w:color w:val="000000"/>
-          <w:sz w:val="23"/>
-          <w:szCs w:val="23"/>
-          <w:rtl w:val="1"/>
-          <w:bCs w:val="0"/>
-          <w:lang w:val="en-US" w:bidi="fa-IR"/>
-        </w:rPr>
-        <w:t xml:space="preserve"> </w:t>
-      </w:r>
-      <w:r>
-        <w:rPr>
-          <w:rFonts w:ascii="Vazirmatn" w:hAnsi="Vazirmatn" w:cs="Vazirmatn" w:eastAsia="Vazirmatn"/>
-          <w:b w:val="0"/>
-          <w:color w:val="000000"/>
-          <w:sz w:val="23"/>
-          <w:szCs w:val="23"/>
-          <w:rtl w:val="1"/>
-          <w:bCs w:val="0"/>
-          <w:lang w:val="en-US" w:bidi="fa-IR"/>
-        </w:rPr>
-        <w:t>و تقریباً یک هرتز ارسال می‌شود و مد جاری باقی می‌ماند. با رفع شرط، هشدار پس از حاشیه زمانی و ارتفاعی مناسب پاک می‌شود.</w:t>
+        <w:t xml:space="preserve">تقریباً هر ثانیه ارسال می‌شود؛ مد پرواز تغییر نمی‌کند. با برطرف‌شدن خطر، هشدار با رعایت حاشیه زمانی و ارتفاعی پاک می‌شود تا نزدیک مرز، مرتب روشن و خاموش نشود.</w:t>
       </w:r>
     </w:p>
     <w:p>
@@ -4450,7 +4063,7 @@
           <w:bCs w:val="0"/>
           <w:lang w:val="en-US" w:bidi="fa-IR"/>
         </w:rPr>
-        <w:t xml:space="preserve">در مسیر اصلی سند، ادامه سقوط تأییدشده همراه با شتاب نزولی بالاتر از ۵ و ارتفاع کمتر از ۱۰۰ متر </w:t>
+        <w:t xml:space="preserve">در مسیر اصلیِ بند ۴٫۲، نزول تأییدشده باید ادامه داشته باشد، شتاب رو به پایین از ۵ متر بر مجذور ثانیه بیشتر شود و ارتفاع از ۱۰۰ متر </w:t>
       </w:r>
       <w:r>
         <w:rPr>
@@ -4463,7 +4076,7 @@
           <w:bCs w:val="0"/>
           <w:lang w:val="en-US" w:bidi="fa-IR"/>
         </w:rPr>
-        <w:t>‎Home‎</w:t>
+        <w:t xml:space="preserve">‎Home‎ </w:t>
       </w:r>
       <w:r>
         <w:rPr>
@@ -4476,7 +4089,7 @@
           <w:bCs w:val="0"/>
           <w:lang w:val="en-US" w:bidi="fa-IR"/>
         </w:rPr>
-        <w:t xml:space="preserve">، از هر مد جاری موجب ورود خودکار به مد ۲۶ </w:t>
+        <w:t xml:space="preserve">پایین‌تر برود. در این شرایط، سیستم از مد جاری وارد مد ۲۶ </w:t>
       </w:r>
       <w:r>
         <w:rPr>
@@ -4489,7 +4102,7 @@
           <w:bCs w:val="0"/>
           <w:lang w:val="en-US" w:bidi="fa-IR"/>
         </w:rPr>
-        <w:t>‎RESCUE‎</w:t>
+        <w:t xml:space="preserve">‎RESCUE‎ </w:t>
       </w:r>
       <w:r>
         <w:rPr>
@@ -4502,7 +4115,20 @@
           <w:bCs w:val="0"/>
           <w:lang w:val="en-US" w:bidi="fa-IR"/>
         </w:rPr>
-        <w:t xml:space="preserve"> </w:t>
+        <w:t xml:space="preserve">می‌شود. پرنده باید مسلح و در حال پرواز باشد و تنظیم معتبر چتر در دسترس باشد. مد </w:t>
+      </w:r>
+      <w:r>
+        <w:rPr>
+          <w:rFonts w:ascii="Vazirmatn" w:hAnsi="Vazirmatn" w:cs="Vazirmatn" w:eastAsia="Vazirmatn"/>
+          <w:b w:val="0"/>
+          <w:color w:val="000000"/>
+          <w:sz w:val="23"/>
+          <w:szCs w:val="23"/>
+          <w:rtl w:val="0"/>
+          <w:bCs w:val="0"/>
+          <w:lang w:val="en-US" w:bidi="fa-IR"/>
+        </w:rPr>
+        <w:t xml:space="preserve">‎TAKEOFF‎ </w:t>
       </w:r>
       <w:r>
         <w:rPr>
@@ -4515,46 +4141,7 @@
           <w:bCs w:val="0"/>
           <w:lang w:val="en-US" w:bidi="fa-IR"/>
         </w:rPr>
-        <w:t xml:space="preserve">می‌شود. شرط‌های مسلح‌بودن، پرواز و در دسترس‌بودن تنظیم معتبر چتر نیز اعمال می‌شوند. برای فرار از تشخیص کاذب، </w:t>
-      </w:r>
-      <w:r>
-        <w:rPr>
-          <w:rFonts w:ascii="Vazirmatn" w:hAnsi="Vazirmatn" w:cs="Vazirmatn" w:eastAsia="Vazirmatn"/>
-          <w:b w:val="0"/>
-          <w:color w:val="000000"/>
-          <w:sz w:val="23"/>
-          <w:szCs w:val="23"/>
-          <w:rtl w:val="0"/>
-          <w:bCs w:val="0"/>
-          <w:lang w:val="en-US" w:bidi="fa-IR"/>
-        </w:rPr>
-        <w:t>‎TAKEOFF‎</w:t>
-      </w:r>
-      <w:r>
-        <w:rPr>
-          <w:rFonts w:ascii="Vazirmatn" w:hAnsi="Vazirmatn" w:cs="Vazirmatn" w:eastAsia="Vazirmatn"/>
-          <w:b w:val="0"/>
-          <w:color w:val="000000"/>
-          <w:sz w:val="23"/>
-          <w:szCs w:val="23"/>
-          <w:rtl w:val="1"/>
-          <w:bCs w:val="0"/>
-          <w:lang w:val="en-US" w:bidi="fa-IR"/>
-        </w:rPr>
-        <w:t xml:space="preserve"> </w:t>
-      </w:r>
-      <w:r>
-        <w:rPr>
-          <w:rFonts w:ascii="Vazirmatn" w:hAnsi="Vazirmatn" w:cs="Vazirmatn" w:eastAsia="Vazirmatn"/>
-          <w:b w:val="0"/>
-          <w:color w:val="000000"/>
-          <w:sz w:val="23"/>
-          <w:szCs w:val="23"/>
-          <w:rtl w:val="1"/>
-          <w:bCs w:val="0"/>
-          <w:lang w:val="en-US" w:bidi="fa-IR"/>
-        </w:rPr>
-        <w:t>را از این حفاظت مستثنا نکرده‌ایم.</w:t>
+        <w:t xml:space="preserve">هم محافظت می‌شود؛ جلوگیری از ورود کاذب با درست‌کردن تشخیص انجام شده است.</w:t>
       </w:r>
     </w:p>
     <w:p>
@@ -4575,7 +4162,7 @@
           <w:bCs w:val="0"/>
           <w:lang w:val="en-US" w:bidi="fa-IR"/>
         </w:rPr>
-        <w:t xml:space="preserve">حفاظت افزوده برای نزول ثابت چنین است: همان نزول یک‌ثانیه‌ای و افت دو متر باید تأیید شود، ارتفاع زیر ۱۰۰ متر باشد، نرخ نزول بالاتر از ۵ متر بر ثانیه و زمان پیش‌بینی رسیدن به تراز </w:t>
+        <w:t xml:space="preserve">در حفاظت تکمیلی نزول ثابت، ابتدا همان یک ثانیه نزول و دو متر افت ارتفاع تأیید می‌شود. سپس باید ارتفاع زیر ۱۰۰ متر، سرعت نزول بیش از ۵ متر بر ثانیه و زمان برآوردی رسیدن به تراز </w:t>
       </w:r>
       <w:r>
         <w:rPr>
@@ -4588,7 +4175,7 @@
           <w:bCs w:val="0"/>
           <w:lang w:val="en-US" w:bidi="fa-IR"/>
         </w:rPr>
-        <w:t>‎Home‎</w:t>
+        <w:t xml:space="preserve">‎Home‎ </w:t>
       </w:r>
       <w:r>
         <w:rPr>
@@ -4601,7 +4188,20 @@
           <w:bCs w:val="0"/>
           <w:lang w:val="en-US" w:bidi="fa-IR"/>
         </w:rPr>
-        <w:t xml:space="preserve"> </w:t>
+        <w:t xml:space="preserve">کمتر از ۶ ثانیه باشد. زیر ۳۰ متر، سرعت نزول بیش از ۲ متر بر ثانیه نیز کافی است؛ شرط زمان همچنان برقرار می‌ماند. این وضعیت باید ۰٫۲ ثانیه ادامه یابد. بیت ۳۲ در لاگ و پیام </w:t>
+      </w:r>
+      <w:r>
+        <w:rPr>
+          <w:rFonts w:ascii="Vazirmatn" w:hAnsi="Vazirmatn" w:cs="Vazirmatn" w:eastAsia="Vazirmatn"/>
+          <w:b w:val="0"/>
+          <w:color w:val="000000"/>
+          <w:sz w:val="23"/>
+          <w:szCs w:val="23"/>
+          <w:rtl w:val="0"/>
+          <w:bCs w:val="0"/>
+          <w:lang w:val="en-US" w:bidi="fa-IR"/>
+        </w:rPr>
+        <w:t xml:space="preserve">‎predicted impact‎</w:t>
       </w:r>
       <w:r>
         <w:rPr>
@@ -4614,46 +4214,7 @@
           <w:bCs w:val="0"/>
           <w:lang w:val="en-US" w:bidi="fa-IR"/>
         </w:rPr>
-        <w:t xml:space="preserve">کمتر از ۶ ثانیه باشد. زیر ۳۰ متر، نرخ بالاتر از ۲ متر بر ثانیه نیز پذیرفته می‌شود. این شرط باید ۰٫۲ ثانیه دوام بیاورد. در لاگ، بیت ۳۲ و پیام </w:t>
-      </w:r>
-      <w:r>
-        <w:rPr>
-          <w:rFonts w:ascii="Vazirmatn" w:hAnsi="Vazirmatn" w:cs="Vazirmatn" w:eastAsia="Vazirmatn"/>
-          <w:b w:val="0"/>
-          <w:color w:val="000000"/>
-          <w:sz w:val="23"/>
-          <w:szCs w:val="23"/>
-          <w:rtl w:val="0"/>
-          <w:bCs w:val="0"/>
-          <w:lang w:val="en-US" w:bidi="fa-IR"/>
-        </w:rPr>
-        <w:t>‎predicted impact‎</w:t>
-      </w:r>
-      <w:r>
-        <w:rPr>
-          <w:rFonts w:ascii="Vazirmatn" w:hAnsi="Vazirmatn" w:cs="Vazirmatn" w:eastAsia="Vazirmatn"/>
-          <w:b w:val="0"/>
-          <w:color w:val="000000"/>
-          <w:sz w:val="23"/>
-          <w:szCs w:val="23"/>
-          <w:rtl w:val="1"/>
-          <w:bCs w:val="0"/>
-          <w:lang w:val="en-US" w:bidi="fa-IR"/>
-        </w:rPr>
-        <w:t xml:space="preserve"> </w:t>
-      </w:r>
-      <w:r>
-        <w:rPr>
-          <w:rFonts w:ascii="Vazirmatn" w:hAnsi="Vazirmatn" w:cs="Vazirmatn" w:eastAsia="Vazirmatn"/>
-          <w:b w:val="0"/>
-          <w:color w:val="000000"/>
-          <w:sz w:val="23"/>
-          <w:szCs w:val="23"/>
-          <w:rtl w:val="1"/>
-          <w:bCs w:val="0"/>
-          <w:lang w:val="en-US" w:bidi="fa-IR"/>
-        </w:rPr>
-        <w:t>علت ورود را مشخص می‌کنند.</w:t>
+        <w:t xml:space="preserve">، علت این نوع ورود را مشخص می‌کنند.</w:t>
       </w:r>
     </w:p>
     <w:p>
@@ -4674,7 +4235,33 @@
           <w:bCs w:val="0"/>
           <w:lang w:val="en-US" w:bidi="fa-IR"/>
         </w:rPr>
-        <w:t>این مسیر عمداً از شرط شتابی سند گسترده‌تر است: در یک نزول تند با سرعت ثابت، شتاب می‌تواند نزدیک صفر باشد. نزول آرامِ تحت کنترل یا ارتفاع کم به‌تنهایی کافی نیست. قصد خلبان نیز به‌تنهایی تضمین‌کننده فاصله توقف ایمن نیست؛ ورود عمدی به همین محدوده خطر می‌تواند حفاظت را فعال کند.</w:t>
+        <w:t xml:space="preserve">دلیل افزودن این مسیر، نزول تندی است که سرعتش تقریباً ثابت شده و شتاب آن نزدیک صفر است. در پرواز ثبت‌شده، پرنده به ۳۰٫۰۶ متر </w:t>
+      </w:r>
+      <w:r>
+        <w:rPr>
+          <w:rFonts w:ascii="Vazirmatn" w:hAnsi="Vazirmatn" w:cs="Vazirmatn" w:eastAsia="Vazirmatn"/>
+          <w:b w:val="0"/>
+          <w:color w:val="000000"/>
+          <w:sz w:val="23"/>
+          <w:szCs w:val="23"/>
+          <w:rtl w:val="0"/>
+          <w:bCs w:val="0"/>
+          <w:lang w:val="en-US" w:bidi="fa-IR"/>
+        </w:rPr>
+        <w:t xml:space="preserve">‎Home‎ </w:t>
+      </w:r>
+      <w:r>
+        <w:rPr>
+          <w:rFonts w:ascii="Vazirmatn" w:hAnsi="Vazirmatn" w:cs="Vazirmatn" w:eastAsia="Vazirmatn"/>
+          <w:b w:val="0"/>
+          <w:color w:val="000000"/>
+          <w:sz w:val="23"/>
+          <w:szCs w:val="23"/>
+          <w:rtl w:val="1"/>
+          <w:bCs w:val="0"/>
+          <w:lang w:val="en-US" w:bidi="fa-IR"/>
+        </w:rPr>
+        <w:t xml:space="preserve">رسید، سرعت نزول ۷٫۶۷ متر بر ثانیه بود و شتاب نزولی حدود منفی ۰٫۰۳۴ متر بر مجذور ثانیه بود؛ شرط اصلیِ شتاب فعال نشد. این حفاظت فراتر از شرط صریح بند ۴٫۲ است. نزول آرام یا ارتفاع کم، به‌تنهایی آن را فعال نمی‌کند؛ شیرجه عمدی هم اگر وارد همین محدوده خطر شود، ممکن است باعث مداخله شود.</w:t>
       </w:r>
     </w:p>
     <w:p>
@@ -4695,7 +4282,7 @@
           <w:bCs w:val="0"/>
           <w:lang w:val="en-US" w:bidi="fa-IR"/>
         </w:rPr>
-        <w:t xml:space="preserve">اگر شتاب جبران‌شده و مشتق فیلترشده سرعت نزول، هر دو ترمز واقعی رو به بالا را تأیید کنند و برآورد توقف بیش از پنج متر بالاتر از </w:t>
+        <w:t xml:space="preserve">اگر هم شتاب جبران‌شده و هم روند سرعت عمودی نشان دهند نزول واقعاً در حال کم‌شدن است و توقف بیش از پنج متر بالاتر از </w:t>
       </w:r>
       <w:r>
         <w:rPr>
@@ -4708,7 +4295,7 @@
           <w:bCs w:val="0"/>
           <w:lang w:val="en-US" w:bidi="fa-IR"/>
         </w:rPr>
-        <w:t>‎Home‎</w:t>
+        <w:t xml:space="preserve">‎Home‎ </w:t>
       </w:r>
       <w:r>
         <w:rPr>
@@ -4721,20 +4308,7 @@
           <w:bCs w:val="0"/>
           <w:lang w:val="en-US" w:bidi="fa-IR"/>
         </w:rPr>
-        <w:t xml:space="preserve"> </w:t>
-      </w:r>
-      <w:r>
-        <w:rPr>
-          <w:rFonts w:ascii="Vazirmatn" w:hAnsi="Vazirmatn" w:cs="Vazirmatn" w:eastAsia="Vazirmatn"/>
-          <w:b w:val="0"/>
-          <w:color w:val="000000"/>
-          <w:sz w:val="23"/>
-          <w:szCs w:val="23"/>
-          <w:rtl w:val="1"/>
-          <w:bCs w:val="0"/>
-          <w:lang w:val="en-US" w:bidi="fa-IR"/>
-        </w:rPr>
-        <w:t>باشد، مسیر تکمیلی مداخله نمی‌کند. برای آغاز بالاکشیدنِ پاسخ‌دار، فقط یک مهلت حداکثر نیم‌ثانیه‌ای در هر نزول وجود دارد؛ بالای ۳۰ متر و با بیش از دو ثانیه فاصله زمانی خطر. حرکت مکرر استیک این مهلت را تمدید نمی‌کند و شرط شتابی اصلی را نیز مسدود نمی‌کند.</w:t>
+        <w:t xml:space="preserve">برآورد شود، مسیر تکمیلی مداخله نمی‌کند. هنگام شروع بالاکشیدن، اگر پرنده واقعاً به فرمان پاسخ بدهد، بالای ۳۰ متر و با بیش از دو ثانیه زمان باقی‌مانده، یک فرصت حداکثر نیم‌ثانیه‌ای داده می‌شود. این فرصت در هر نزول فقط یک بار است؛ حرکت مکرر استیک آن را تمدید نمی‌کند و شرط اصلی شتاب را هم کنار نمی‌زند.</w:t>
       </w:r>
     </w:p>
     <w:p>
@@ -4783,7 +4357,7 @@
           <w:bCs w:val="0"/>
           <w:lang w:val="en-US" w:bidi="fa-IR"/>
         </w:rPr>
-        <w:t xml:space="preserve">هدف ارتفاع را به </w:t>
+        <w:t xml:space="preserve">هدف ارتفاع را روی </w:t>
       </w:r>
       <w:r>
         <w:rPr>
@@ -4796,7 +4370,7 @@
           <w:bCs w:val="0"/>
           <w:lang w:val="en-US" w:bidi="fa-IR"/>
         </w:rPr>
-        <w:t>‎RSC_ALT_WARN‎</w:t>
+        <w:t xml:space="preserve">‎RSC_ALT_WARN‎ </w:t>
       </w:r>
       <w:r>
         <w:rPr>
@@ -4809,7 +4383,20 @@
           <w:bCs w:val="0"/>
           <w:lang w:val="en-US" w:bidi="fa-IR"/>
         </w:rPr>
-        <w:t xml:space="preserve"> </w:t>
+        <w:t xml:space="preserve">می‌گذاریم و مدیریت ارتفاع و سرعت را به </w:t>
+      </w:r>
+      <w:r>
+        <w:rPr>
+          <w:rFonts w:ascii="Vazirmatn" w:hAnsi="Vazirmatn" w:cs="Vazirmatn" w:eastAsia="Vazirmatn"/>
+          <w:b w:val="0"/>
+          <w:color w:val="000000"/>
+          <w:sz w:val="23"/>
+          <w:szCs w:val="23"/>
+          <w:rtl w:val="0"/>
+          <w:bCs w:val="0"/>
+          <w:lang w:val="en-US" w:bidi="fa-IR"/>
+        </w:rPr>
+        <w:t xml:space="preserve">‎TECS‎ </w:t>
       </w:r>
       <w:r>
         <w:rPr>
@@ -4822,7 +4409,7 @@
           <w:bCs w:val="0"/>
           <w:lang w:val="en-US" w:bidi="fa-IR"/>
         </w:rPr>
-        <w:t xml:space="preserve">می‌دهیم و اهداف ارتفاع و سرعت را با </w:t>
+        <w:t xml:space="preserve">موجود می‌سپاریم. هدف رول صفر است و همان کنترلگرهای وضعیت </w:t>
       </w:r>
       <w:r>
         <w:rPr>
@@ -4835,7 +4422,7 @@
           <w:bCs w:val="0"/>
           <w:lang w:val="en-US" w:bidi="fa-IR"/>
         </w:rPr>
-        <w:t>‎TECS‎</w:t>
+        <w:t xml:space="preserve">‎ArduPilot‎ </w:t>
       </w:r>
       <w:r>
         <w:rPr>
@@ -4848,7 +4435,20 @@
           <w:bCs w:val="0"/>
           <w:lang w:val="en-US" w:bidi="fa-IR"/>
         </w:rPr>
-        <w:t xml:space="preserve"> </w:t>
+        <w:t xml:space="preserve">سطوح پروازی را هدایت می‌کنند. در بخش اصلی اوج‌گیری، بیشترین گاز مجاز با رعایت محدودیت خروجی، توان و نرخ تغییر درخواست می‌شود. نزدیک ارتفاع هدف، </w:t>
+      </w:r>
+      <w:r>
+        <w:rPr>
+          <w:rFonts w:ascii="Vazirmatn" w:hAnsi="Vazirmatn" w:cs="Vazirmatn" w:eastAsia="Vazirmatn"/>
+          <w:b w:val="0"/>
+          <w:color w:val="000000"/>
+          <w:sz w:val="23"/>
+          <w:szCs w:val="23"/>
+          <w:rtl w:val="0"/>
+          <w:bCs w:val="0"/>
+          <w:lang w:val="en-US" w:bidi="fa-IR"/>
+        </w:rPr>
+        <w:t xml:space="preserve">‎TECS‎ </w:t>
       </w:r>
       <w:r>
         <w:rPr>
@@ -4861,46 +4461,7 @@
           <w:bCs w:val="0"/>
           <w:lang w:val="en-US" w:bidi="fa-IR"/>
         </w:rPr>
-        <w:t xml:space="preserve">موجود مدیریت می‌کنیم. هدف رول صفر است و کنترلگرهای وضعیت موجود سطوح پروازی را هدایت می‌کنند. در بخش اصلی اوج‌گیری، کامل‌ترین گازِ مجاز با رعایت محدودیت خروجی، توان و نرخ تغییر درخواست می‌شود. نزدیک هدف، </w:t>
-      </w:r>
-      <w:r>
-        <w:rPr>
-          <w:rFonts w:ascii="Vazirmatn" w:hAnsi="Vazirmatn" w:cs="Vazirmatn" w:eastAsia="Vazirmatn"/>
-          <w:b w:val="0"/>
-          <w:color w:val="000000"/>
-          <w:sz w:val="23"/>
-          <w:szCs w:val="23"/>
-          <w:rtl w:val="0"/>
-          <w:bCs w:val="0"/>
-          <w:lang w:val="en-US" w:bidi="fa-IR"/>
-        </w:rPr>
-        <w:t>‎TECS‎</w:t>
-      </w:r>
-      <w:r>
-        <w:rPr>
-          <w:rFonts w:ascii="Vazirmatn" w:hAnsi="Vazirmatn" w:cs="Vazirmatn" w:eastAsia="Vazirmatn"/>
-          <w:b w:val="0"/>
-          <w:color w:val="000000"/>
-          <w:sz w:val="23"/>
-          <w:szCs w:val="23"/>
-          <w:rtl w:val="1"/>
-          <w:bCs w:val="0"/>
-          <w:lang w:val="en-US" w:bidi="fa-IR"/>
-        </w:rPr>
-        <w:t xml:space="preserve"> </w:t>
-      </w:r>
-      <w:r>
-        <w:rPr>
-          <w:rFonts w:ascii="Vazirmatn" w:hAnsi="Vazirmatn" w:cs="Vazirmatn" w:eastAsia="Vazirmatn"/>
-          <w:b w:val="0"/>
-          <w:color w:val="000000"/>
-          <w:sz w:val="23"/>
-          <w:szCs w:val="23"/>
-          <w:rtl w:val="1"/>
-          <w:bCs w:val="0"/>
-          <w:lang w:val="en-US" w:bidi="fa-IR"/>
-        </w:rPr>
-        <w:t>گاز را برای تثبیت تنظیم می‌کند؛ قانون مستقل پیچ یا گاز برای بازیابی ننوشته‌ایم.</w:t>
+        <w:t xml:space="preserve">گاز را برای تثبیت تنظیم می‌کند. برای بازیابی، قانون جداگانه پیچ یا گاز ننوشته‌ایم.</w:t>
       </w:r>
     </w:p>
     <w:p>
@@ -4921,7 +4482,7 @@
           <w:bCs w:val="0"/>
           <w:lang w:val="en-US" w:bidi="fa-IR"/>
         </w:rPr>
-        <w:t xml:space="preserve">در ورود اضطراری، حالت داخلیِ نرخ تغییر فرمان پیچ </w:t>
+        <w:t xml:space="preserve">در ورود از شیرجه تند، محدودیت تدریجی تغییر فرمان پیچ </w:t>
       </w:r>
       <w:r>
         <w:rPr>
@@ -4934,7 +4495,7 @@
           <w:bCs w:val="0"/>
           <w:lang w:val="en-US" w:bidi="fa-IR"/>
         </w:rPr>
-        <w:t>‎TECS‎</w:t>
+        <w:t xml:space="preserve">‎TECS‎ </w:t>
       </w:r>
       <w:r>
         <w:rPr>
@@ -4947,7 +4508,20 @@
           <w:bCs w:val="0"/>
           <w:lang w:val="en-US" w:bidi="fa-IR"/>
         </w:rPr>
-        <w:t xml:space="preserve"> </w:t>
+        <w:t xml:space="preserve">می‌توانست خروج را عقب بیندازد. هنگام ورود اضطراری، مقدار اولیه این محدودکننده را در همان حدود پیچ مجاز تنظیم می‌کنیم. سپس </w:t>
+      </w:r>
+      <w:r>
+        <w:rPr>
+          <w:rFonts w:ascii="Vazirmatn" w:hAnsi="Vazirmatn" w:cs="Vazirmatn" w:eastAsia="Vazirmatn"/>
+          <w:b w:val="0"/>
+          <w:color w:val="000000"/>
+          <w:sz w:val="23"/>
+          <w:szCs w:val="23"/>
+          <w:rtl w:val="0"/>
+          <w:bCs w:val="0"/>
+          <w:lang w:val="en-US" w:bidi="fa-IR"/>
+        </w:rPr>
+        <w:t xml:space="preserve">‎TECS‎ </w:t>
       </w:r>
       <w:r>
         <w:rPr>
@@ -4960,7 +4534,7 @@
           <w:bCs w:val="0"/>
           <w:lang w:val="en-US" w:bidi="fa-IR"/>
         </w:rPr>
-        <w:t>را داخل حدود پیچ مجاز مقداردهی می‌کنیم تا شیرجه نزدیک عمودی، چند ثانیه تأخیر بی‌فایده در خروج ایجاد نکند. کنترل انرژی و محدودیت‌های موجود سرعت و واماندگی برقرار می‌مانند. این تغییر مخصوص ورود اضطراری است.</w:t>
+        <w:t xml:space="preserve">کنترل را ادامه می‌دهد؛ کنترل انرژی و محدودیت‌های سرعت و واماندگی برقرار می‌مانند.</w:t>
       </w:r>
     </w:p>
     <w:p>
@@ -5489,7 +5063,7 @@
           <w:bCs w:val="0"/>
           <w:lang w:val="en-US" w:bidi="fa-IR"/>
         </w:rPr>
-        <w:t xml:space="preserve">پس از احراز این معیارها، پیام «پرنده تثبیت شد» و تایمر پنج‌ثانیه‌ای آغاز می‌شود. تغییر مد معتبر خلبان، از جمله </w:t>
+        <w:t xml:space="preserve">وقتی همه این معیارها برقرار بمانند، پیام «پرنده تثبیت شد» ارسال و مهلت پنج‌ثانیه‌ای آغاز می‌شود. اگر خلبان در این فاصله یک مد معتبر، مانند </w:t>
       </w:r>
       <w:r>
         <w:rPr>
@@ -5502,7 +5076,7 @@
           <w:bCs w:val="0"/>
           <w:lang w:val="en-US" w:bidi="fa-IR"/>
         </w:rPr>
-        <w:t>‎FBWA‎</w:t>
+        <w:t xml:space="preserve">‎FBWA‎</w:t>
       </w:r>
       <w:r>
         <w:rPr>
@@ -5515,7 +5089,7 @@
           <w:bCs w:val="0"/>
           <w:lang w:val="en-US" w:bidi="fa-IR"/>
         </w:rPr>
-        <w:t>، طبق سند پذیرفته می‌شود. از دست‌رفتن پایداری در پنجره واگذاری، بررسی بازیابی را دوباره فعال می‌کند.</w:t>
+        <w:t xml:space="preserve">، انتخاب کند، سیستم به آن مد می‌رود. اگر پایداری از دست برود، سیستم دوباره وضعیت بازیابی را بررسی می‌کند.</w:t>
       </w:r>
     </w:p>
     <w:p>
@@ -5536,7 +5110,7 @@
           <w:bCs w:val="0"/>
           <w:lang w:val="en-US" w:bidi="fa-IR"/>
         </w:rPr>
-        <w:t xml:space="preserve">پاسخ با استیک یا گاز، قابلیت افزوده قابل خاموش‌کردن است. با </w:t>
+        <w:t xml:space="preserve">پذیرش حرکت استیک یا گاز، یک قابلیت اختیاری افزوده است. با </w:t>
       </w:r>
       <w:r>
         <w:rPr>
@@ -5549,7 +5123,7 @@
           <w:bCs w:val="0"/>
           <w:lang w:val="en-US" w:bidi="fa-IR"/>
         </w:rPr>
-        <w:t>‎RSC_STK_EN=1‎</w:t>
+        <w:t xml:space="preserve">‎RSC_STK_EN=1‎</w:t>
       </w:r>
       <w:r>
         <w:rPr>
@@ -5562,7 +5136,7 @@
           <w:bCs w:val="0"/>
           <w:lang w:val="en-US" w:bidi="fa-IR"/>
         </w:rPr>
-        <w:t xml:space="preserve">، تغییر تازه حداقل ۱۲۰ میکروثانیه نسبت به مبنای لحظه تثبیت باید ۰٫۳ ثانیه با ورودی معتبر ادامه یابد؛ سپس کنترل به </w:t>
+        <w:t xml:space="preserve">، ورودی تازه و معتبر باید نسبت به لحظه تثبیت، دست‌کم ۱۲۰ میکروثانیه تغییر کند و این تغییر ۰٫۳ ثانیه بماند؛ سپس کنترل به </w:t>
       </w:r>
       <w:r>
         <w:rPr>
@@ -5575,7 +5149,7 @@
           <w:bCs w:val="0"/>
           <w:lang w:val="en-US" w:bidi="fa-IR"/>
         </w:rPr>
-        <w:t>‎FBWA‎</w:t>
+        <w:t xml:space="preserve">‎FBWA‎ </w:t>
       </w:r>
       <w:r>
         <w:rPr>
@@ -5588,20 +5162,7 @@
           <w:bCs w:val="0"/>
           <w:lang w:val="en-US" w:bidi="fa-IR"/>
         </w:rPr>
-        <w:t xml:space="preserve"> </w:t>
-      </w:r>
-      <w:r>
-        <w:rPr>
-          <w:rFonts w:ascii="Vazirmatn" w:hAnsi="Vazirmatn" w:cs="Vazirmatn" w:eastAsia="Vazirmatn"/>
-          <w:b w:val="0"/>
-          <w:color w:val="000000"/>
-          <w:sz w:val="23"/>
-          <w:szCs w:val="23"/>
-          <w:rtl w:val="1"/>
-          <w:bCs w:val="0"/>
-          <w:lang w:val="en-US" w:bidi="fa-IR"/>
-        </w:rPr>
-        <w:t>واگذار می‌شود. ورودی ثابت قبلی، نویز و پیام کهنه پاسخ محسوب نمی‌شوند. مقدار صفر، رفتار «فقط تغییر مد» را نگه می‌دارد.</w:t>
+        <w:t xml:space="preserve">واگذار می‌شود. موقعیت ثابت قبلی، نویز و پیام قدیمی پاسخ محسوب نمی‌شوند. با مقدار صفر، فقط تغییر مدِ خواسته‌شده در بند ۴٫۴ پذیرفته می‌شود.</w:t>
       </w:r>
     </w:p>
     <w:p>
@@ -5658,7 +5219,7 @@
           <w:bCs w:val="0"/>
           <w:lang w:val="en-US" w:bidi="fa-IR"/>
         </w:rPr>
-        <w:t>‎RSC_HAND_S‎</w:t>
+        <w:t xml:space="preserve">‎RSC_HAND_S‎ </w:t>
       </w:r>
       <w:r>
         <w:rPr>
@@ -5671,7 +5232,20 @@
           <w:bCs w:val="0"/>
           <w:lang w:val="en-US" w:bidi="fa-IR"/>
         </w:rPr>
-        <w:t xml:space="preserve"> </w:t>
+        <w:t xml:space="preserve">بدون پاسخ معتبر تمام شود، </w:t>
+      </w:r>
+      <w:r>
+        <w:rPr>
+          <w:rFonts w:ascii="Vazirmatn" w:hAnsi="Vazirmatn" w:cs="Vazirmatn" w:eastAsia="Vazirmatn"/>
+          <w:b w:val="0"/>
+          <w:color w:val="000000"/>
+          <w:sz w:val="23"/>
+          <w:szCs w:val="23"/>
+          <w:rtl w:val="0"/>
+          <w:bCs w:val="0"/>
+          <w:lang w:val="en-US" w:bidi="fa-IR"/>
+        </w:rPr>
+        <w:t xml:space="preserve">‎AP_Parachute‎ </w:t>
       </w:r>
       <w:r>
         <w:rPr>
@@ -5684,85 +5258,7 @@
           <w:bCs w:val="0"/>
           <w:lang w:val="en-US" w:bidi="fa-IR"/>
         </w:rPr>
-        <w:t xml:space="preserve">بدون پاسخ تمام شود، </w:t>
-      </w:r>
-      <w:r>
-        <w:rPr>
-          <w:rFonts w:ascii="Vazirmatn" w:hAnsi="Vazirmatn" w:cs="Vazirmatn" w:eastAsia="Vazirmatn"/>
-          <w:b w:val="0"/>
-          <w:color w:val="000000"/>
-          <w:sz w:val="23"/>
-          <w:szCs w:val="23"/>
-          <w:rtl w:val="0"/>
-          <w:bCs w:val="0"/>
-          <w:lang w:val="en-US" w:bidi="fa-IR"/>
-        </w:rPr>
-        <w:t>‎AP_Parachute‎</w:t>
-      </w:r>
-      <w:r>
-        <w:rPr>
-          <w:rFonts w:ascii="Vazirmatn" w:hAnsi="Vazirmatn" w:cs="Vazirmatn" w:eastAsia="Vazirmatn"/>
-          <w:b w:val="0"/>
-          <w:color w:val="000000"/>
-          <w:sz w:val="23"/>
-          <w:szCs w:val="23"/>
-          <w:rtl w:val="1"/>
-          <w:bCs w:val="0"/>
-          <w:lang w:val="en-US" w:bidi="fa-IR"/>
-        </w:rPr>
-        <w:t xml:space="preserve"> </w:t>
-      </w:r>
-      <w:r>
-        <w:rPr>
-          <w:rFonts w:ascii="Vazirmatn" w:hAnsi="Vazirmatn" w:cs="Vazirmatn" w:eastAsia="Vazirmatn"/>
-          <w:b w:val="0"/>
-          <w:color w:val="000000"/>
-          <w:sz w:val="23"/>
-          <w:szCs w:val="23"/>
-          <w:rtl w:val="1"/>
-          <w:bCs w:val="0"/>
-          <w:lang w:val="en-US" w:bidi="fa-IR"/>
-        </w:rPr>
-        <w:t xml:space="preserve">را فراخوانی می‌کنیم، موتور قطع و پرنده </w:t>
-      </w:r>
-      <w:r>
-        <w:rPr>
-          <w:rFonts w:ascii="Vazirmatn" w:hAnsi="Vazirmatn" w:cs="Vazirmatn" w:eastAsia="Vazirmatn"/>
-          <w:b w:val="0"/>
-          <w:color w:val="000000"/>
-          <w:sz w:val="23"/>
-          <w:szCs w:val="23"/>
-          <w:rtl w:val="0"/>
-          <w:bCs w:val="0"/>
-          <w:lang w:val="en-US" w:bidi="fa-IR"/>
-        </w:rPr>
-        <w:t>‎disarm‎</w:t>
-      </w:r>
-      <w:r>
-        <w:rPr>
-          <w:rFonts w:ascii="Vazirmatn" w:hAnsi="Vazirmatn" w:cs="Vazirmatn" w:eastAsia="Vazirmatn"/>
-          <w:b w:val="0"/>
-          <w:color w:val="000000"/>
-          <w:sz w:val="23"/>
-          <w:szCs w:val="23"/>
-          <w:rtl w:val="1"/>
-          <w:bCs w:val="0"/>
-          <w:lang w:val="en-US" w:bidi="fa-IR"/>
-        </w:rPr>
-        <w:t xml:space="preserve"> </w:t>
-      </w:r>
-      <w:r>
-        <w:rPr>
-          <w:rFonts w:ascii="Vazirmatn" w:hAnsi="Vazirmatn" w:cs="Vazirmatn" w:eastAsia="Vazirmatn"/>
-          <w:b w:val="0"/>
-          <w:color w:val="000000"/>
-          <w:sz w:val="23"/>
-          <w:szCs w:val="23"/>
-          <w:rtl w:val="1"/>
-          <w:bCs w:val="0"/>
-          <w:lang w:val="en-US" w:bidi="fa-IR"/>
-        </w:rPr>
-        <w:t>می‌شود. در پروفایل آزمون، تأخیر خروجی رهاساز ۰٫۵ ثانیه و بازشدن تدریجی مدل چتر ۱٫۵ ثانیه است. پس از رهاسازی، یک شبیه‌سازی تازه برای بسته‌بندی مجدد چتر لازم است.</w:t>
+        <w:t xml:space="preserve">فراخوانی می‌شود، موتور قطع می‌شود و پرنده از حالت مسلح خارج می‌شود. در پروفایل آزمون، رهاساز پس از ۰٫۵ ثانیه فعال می‌شود و چترِ مدل طی ۱٫۵ ثانیه باز می‌شود. برای آزمون دوباره با چتر بسته، باید شبیه‌سازی تازه‌ای آغاز شود.</w:t>
       </w:r>
     </w:p>
     <w:p>
@@ -6648,7 +6144,7 @@
           <w:bCs w:val="0"/>
           <w:lang w:val="en-US" w:bidi="fa-IR"/>
         </w:rPr>
-        <w:t>تراز ناپایدار را فقط با یک زاویه لحظه‌ای تعریف نکرده‌ایم. معیارهای زاویه و نرخ، تداوم زمانی و سرعت هوایی را با هم بررسی می‌کنیم؛ ازاین‌رو عبور لحظه‌ای از رول صفر در یک چرخش کامل، تثبیت محسوب نمی‌شود. زاویه شدید به‌تنهایی نیز محرک ورود اضطراری نیست.</w:t>
+        <w:t xml:space="preserve">برای اعلام پرواز پایدار، فقط یک زاویه لحظه‌ای کافی نیست؛ زاویه‌ها، سرعت چرخش، سرعت هوایی و مدت ادامه این شرایط با هم بررسی می‌شوند. بنابراین در یک چرخش کامل، عبور لحظه‌ای بال‌ها از حالت تراز، به‌معنی تثبیت نیست. از طرف دیگر، زاویه شدید به‌تنهایی باعث ورود اضطراری نمی‌شود.</w:t>
       </w:r>
     </w:p>
     <w:p>
@@ -6669,7 +6165,7 @@
           <w:bCs w:val="0"/>
           <w:lang w:val="en-US" w:bidi="fa-IR"/>
         </w:rPr>
-        <w:t xml:space="preserve">حفاظت نزول ثابت، فرصت محدود بالاکشیدن، پاسخ استیک، مدل تدریجی چتر و پنل گزارش‌گیری توسعه‌های اجرایی ما هستند. آستانه‌ها با مدل حاضر آزموده شده‌اند. </w:t>
+        <w:t xml:space="preserve">حفاظت نزول ثابت، فرصت کوتاه بالاکشیدن، پاسخ با استیک، مدل بازشدن تدریجی چتر و پنل گزارش، قابلیت‌های تکمیلی ما هستند. حدود آن‌ها با همین مدل آزموده شده‌اند. ارتفاع </w:t>
       </w:r>
       <w:r>
         <w:rPr>
@@ -6682,7 +6178,7 @@
           <w:bCs w:val="0"/>
           <w:lang w:val="en-US" w:bidi="fa-IR"/>
         </w:rPr>
-        <w:t>‎Home‎</w:t>
+        <w:t xml:space="preserve">‎Home‎ </w:t>
       </w:r>
       <w:r>
         <w:rPr>
@@ -6695,20 +6191,7 @@
           <w:bCs w:val="0"/>
           <w:lang w:val="en-US" w:bidi="fa-IR"/>
         </w:rPr>
-        <w:t xml:space="preserve"> </w:t>
-      </w:r>
-      <w:r>
-        <w:rPr>
-          <w:rFonts w:ascii="Vazirmatn" w:hAnsi="Vazirmatn" w:cs="Vazirmatn" w:eastAsia="Vazirmatn"/>
-          <w:b w:val="0"/>
-          <w:color w:val="000000"/>
-          <w:sz w:val="23"/>
-          <w:szCs w:val="23"/>
-          <w:rtl w:val="1"/>
-          <w:bCs w:val="0"/>
-          <w:lang w:val="en-US" w:bidi="fa-IR"/>
-        </w:rPr>
-        <w:t>ارتفاع زمین زیر پرنده نیست؛ زمین مرتفع‌تر، تأخیر تخمین، شروع بسیار دیرهنگام شیرجه و محدودیت عملکرد پرنده می‌توانند بازیابی را ناممکن کنند.</w:t>
+        <w:t xml:space="preserve">با فاصله از زمین زیر پرنده یکی نیست؛ زمین مرتفع، تأخیر تخمین، شیرجه بسیار دیرهنگام یا کمبود توان پرنده می‌تواند نجات را ناممکن کند.</w:t>
       </w:r>
     </w:p>
     <w:p>
@@ -6729,7 +6212,7 @@
           <w:bCs w:val="0"/>
           <w:lang w:val="en-US" w:bidi="fa-IR"/>
         </w:rPr>
-        <w:t xml:space="preserve">آزمون با کنترل مجازیِ خود </w:t>
+        <w:t xml:space="preserve">آزمون با کنترل مجازی </w:t>
       </w:r>
       <w:r>
         <w:rPr>
@@ -6742,7 +6225,7 @@
           <w:bCs w:val="0"/>
           <w:lang w:val="en-US" w:bidi="fa-IR"/>
         </w:rPr>
-        <w:t>‎QGroundControl‎</w:t>
+        <w:t xml:space="preserve">‎QGroundControl‎ </w:t>
       </w:r>
       <w:r>
         <w:rPr>
@@ -6755,7 +6238,20 @@
           <w:bCs w:val="0"/>
           <w:lang w:val="en-US" w:bidi="fa-IR"/>
         </w:rPr>
-        <w:t xml:space="preserve"> </w:t>
+        <w:t xml:space="preserve">جدا از آزمون‌های تکرارپذیر </w:t>
+      </w:r>
+      <w:r>
+        <w:rPr>
+          <w:rFonts w:ascii="Vazirmatn" w:hAnsi="Vazirmatn" w:cs="Vazirmatn" w:eastAsia="Vazirmatn"/>
+          <w:b w:val="0"/>
+          <w:color w:val="000000"/>
+          <w:sz w:val="23"/>
+          <w:szCs w:val="23"/>
+          <w:rtl w:val="0"/>
+          <w:bCs w:val="0"/>
+          <w:lang w:val="en-US" w:bidi="fa-IR"/>
+        </w:rPr>
+        <w:t xml:space="preserve">‎MAVLink‎ </w:t>
       </w:r>
       <w:r>
         <w:rPr>
@@ -6768,46 +6264,7 @@
           <w:bCs w:val="0"/>
           <w:lang w:val="en-US" w:bidi="fa-IR"/>
         </w:rPr>
-        <w:t xml:space="preserve">جدا از تست‌های تکرارپذیر </w:t>
-      </w:r>
-      <w:r>
-        <w:rPr>
-          <w:rFonts w:ascii="Vazirmatn" w:hAnsi="Vazirmatn" w:cs="Vazirmatn" w:eastAsia="Vazirmatn"/>
-          <w:b w:val="0"/>
-          <w:color w:val="000000"/>
-          <w:sz w:val="23"/>
-          <w:szCs w:val="23"/>
-          <w:rtl w:val="0"/>
-          <w:bCs w:val="0"/>
-          <w:lang w:val="en-US" w:bidi="fa-IR"/>
-        </w:rPr>
-        <w:t>‎MAVLink‎</w:t>
-      </w:r>
-      <w:r>
-        <w:rPr>
-          <w:rFonts w:ascii="Vazirmatn" w:hAnsi="Vazirmatn" w:cs="Vazirmatn" w:eastAsia="Vazirmatn"/>
-          <w:b w:val="0"/>
-          <w:color w:val="000000"/>
-          <w:sz w:val="23"/>
-          <w:szCs w:val="23"/>
-          <w:rtl w:val="1"/>
-          <w:bCs w:val="0"/>
-          <w:lang w:val="en-US" w:bidi="fa-IR"/>
-        </w:rPr>
-        <w:t xml:space="preserve"> </w:t>
-      </w:r>
-      <w:r>
-        <w:rPr>
-          <w:rFonts w:ascii="Vazirmatn" w:hAnsi="Vazirmatn" w:cs="Vazirmatn" w:eastAsia="Vazirmatn"/>
-          <w:b w:val="0"/>
-          <w:color w:val="000000"/>
-          <w:sz w:val="23"/>
-          <w:szCs w:val="23"/>
-          <w:rtl w:val="1"/>
-          <w:bCs w:val="0"/>
-          <w:lang w:val="en-US" w:bidi="fa-IR"/>
-        </w:rPr>
-        <w:t>ثبت شده است. مجموعه کامل ده آزمون دستی هنوز تکمیل نشده و به‌عنوان نتیجه موفق ارائه نمی‌شود.</w:t>
+        <w:t xml:space="preserve">ثبت شده است. مجموعه ده آزمون دستی هنوز کامل نشده و نتیجه موفق برای آن اعلام نمی‌کنیم.</w:t>
       </w:r>
     </w:p>
     <w:p>
@@ -7438,7 +6895,7 @@
           <w:bCs w:val="0"/>
           <w:lang w:val="en-US" w:bidi="fa-IR"/>
         </w:rPr>
-        <w:t xml:space="preserve">بسته اجرایی به همان فریمور تأییدشده نسخه ۳٫۰٫۱ متکی است. بسته ارائه، علاوه بر پنج قلم بالا، پرزنتیشن وب و ویدئوهای بازپخش را دارد. باینری، پچ، پارامترها و لاگ‌ها با هش </w:t>
+        <w:t xml:space="preserve">بسته اجرایی از همان فریمور تأییدشده نسخه ۳٫۰٫۱ استفاده می‌کند. علاوه بر پنج قلم بالا، ارائه وب و ویدئوهای بازپخش هم آماده‌اند. با هش </w:t>
       </w:r>
       <w:r>
         <w:rPr>
@@ -7451,7 +6908,7 @@
           <w:bCs w:val="0"/>
           <w:lang w:val="en-US" w:bidi="fa-IR"/>
         </w:rPr>
-        <w:t>‎SHA256‎</w:t>
+        <w:t xml:space="preserve">‎SHA256‎ </w:t>
       </w:r>
       <w:r>
         <w:rPr>
@@ -7464,20 +6921,7 @@
           <w:bCs w:val="0"/>
           <w:lang w:val="en-US" w:bidi="fa-IR"/>
         </w:rPr>
-        <w:t xml:space="preserve"> </w:t>
-      </w:r>
-      <w:r>
-        <w:rPr>
-          <w:rFonts w:ascii="Vazirmatn" w:hAnsi="Vazirmatn" w:cs="Vazirmatn" w:eastAsia="Vazirmatn"/>
-          <w:b w:val="0"/>
-          <w:color w:val="000000"/>
-          <w:sz w:val="23"/>
-          <w:szCs w:val="23"/>
-          <w:rtl w:val="1"/>
-          <w:bCs w:val="0"/>
-          <w:lang w:val="en-US" w:bidi="fa-IR"/>
-        </w:rPr>
-        <w:t>قابل تطبیق‌اند.</w:t>
+        <w:t xml:space="preserve">می‌توان تطابق باینری، پچ، پارامترها و لاگ‌ها را بررسی کرد.</w:t>
       </w:r>
     </w:p>
     <w:tbl>
@@ -8015,7 +7459,7 @@
           <w:bCs w:val="0"/>
           <w:lang w:val="en-US" w:bidi="fa-IR"/>
         </w:rPr>
-        <w:t xml:space="preserve">در همین پرواز، ورود با شتاب ۷٫۴۲ و ارتفاع ۹۹٫۹۶ متر رخ داد. تثبیت در ۱۹۷٫۲۹ متر تأیید شد و حدود ۵٫۰۲ ثانیه بعد، درخواست چتر ثبت شد. </w:t>
+        <w:t xml:space="preserve">در این پرواز، سیستم با شتاب ۷٫۴۲ و در ارتفاع ۹۹٫۹۶ متر کنترل را گرفت. پایداری در ۱۹۷٫۲۹ متر تأیید شد و حدود ۵٫۰۲ ثانیه بعد درخواست چتر ثبت شد. پیام‌های </w:t>
       </w:r>
       <w:r>
         <w:rPr>
@@ -8028,20 +7472,7 @@
           <w:bCs w:val="0"/>
           <w:lang w:val="en-US" w:bidi="fa-IR"/>
         </w:rPr>
-        <w:t>‎RCOU‎</w:t>
-      </w:r>
-      <w:r>
-        <w:rPr>
-          <w:rFonts w:ascii="Vazirmatn" w:hAnsi="Vazirmatn" w:cs="Vazirmatn" w:eastAsia="Vazirmatn"/>
-          <w:b w:val="0"/>
-          <w:color w:val="000000"/>
-          <w:sz w:val="21"/>
-          <w:szCs w:val="21"/>
-          <w:rtl w:val="1"/>
-          <w:bCs w:val="0"/>
-          <w:lang w:val="en-US" w:bidi="fa-IR"/>
-        </w:rPr>
-        <w:t xml:space="preserve"> </w:t>
+        <w:t xml:space="preserve">‎RCOU‎ </w:t>
       </w:r>
       <w:r>
         <w:rPr>
@@ -8067,7 +7498,7 @@
           <w:bCs w:val="0"/>
           <w:lang w:val="en-US" w:bidi="fa-IR"/>
         </w:rPr>
-        <w:t>‎ARM‎</w:t>
+        <w:t xml:space="preserve">‎ARM‎</w:t>
       </w:r>
       <w:r>
         <w:rPr>
@@ -8080,59 +7511,7 @@
           <w:bCs w:val="0"/>
           <w:lang w:val="en-US" w:bidi="fa-IR"/>
         </w:rPr>
-        <w:t xml:space="preserve"> </w:t>
-      </w:r>
-      <w:r>
-        <w:rPr>
-          <w:rFonts w:ascii="Vazirmatn" w:hAnsi="Vazirmatn" w:cs="Vazirmatn" w:eastAsia="Vazirmatn"/>
-          <w:b w:val="0"/>
-          <w:color w:val="000000"/>
-          <w:sz w:val="21"/>
-          <w:szCs w:val="21"/>
-          <w:rtl w:val="1"/>
-          <w:bCs w:val="0"/>
-          <w:lang w:val="en-US" w:bidi="fa-IR"/>
-        </w:rPr>
-        <w:t xml:space="preserve">قطع موتور و </w:t>
-      </w:r>
-      <w:r>
-        <w:rPr>
-          <w:rFonts w:ascii="Vazirmatn" w:hAnsi="Vazirmatn" w:cs="Vazirmatn" w:eastAsia="Vazirmatn"/>
-          <w:b w:val="0"/>
-          <w:color w:val="000000"/>
-          <w:sz w:val="21"/>
-          <w:szCs w:val="21"/>
-          <w:rtl w:val="0"/>
-          <w:bCs w:val="0"/>
-          <w:lang w:val="en-US" w:bidi="fa-IR"/>
-        </w:rPr>
-        <w:t>‎disarm‎</w:t>
-      </w:r>
-      <w:r>
-        <w:rPr>
-          <w:rFonts w:ascii="Vazirmatn" w:hAnsi="Vazirmatn" w:cs="Vazirmatn" w:eastAsia="Vazirmatn"/>
-          <w:b w:val="0"/>
-          <w:color w:val="000000"/>
-          <w:sz w:val="21"/>
-          <w:szCs w:val="21"/>
-          <w:rtl w:val="1"/>
-          <w:bCs w:val="0"/>
-          <w:lang w:val="en-US" w:bidi="fa-IR"/>
-        </w:rPr>
-        <w:t xml:space="preserve"> </w:t>
-      </w:r>
-      <w:r>
-        <w:rPr>
-          <w:rFonts w:ascii="Vazirmatn" w:hAnsi="Vazirmatn" w:cs="Vazirmatn" w:eastAsia="Vazirmatn"/>
-          <w:b w:val="0"/>
-          <w:color w:val="000000"/>
-          <w:sz w:val="21"/>
-          <w:szCs w:val="21"/>
-          <w:rtl w:val="1"/>
-          <w:bCs w:val="0"/>
-          <w:lang w:val="en-US" w:bidi="fa-IR"/>
-        </w:rPr>
-        <w:t>را تأیید می‌کنند. رهاساز پس از تأخیر تنظیم‌شده فعال می‌شود؛ جدول، زمان درخواست ناظر را نشان می‌دهد.</w:t>
+        <w:t xml:space="preserve">، قطع موتور و خروج از حالت مسلح را نشان می‌دهند. زمان جدول، لحظه درخواست چتر است؛ فعال‌شدن رهاساز، تأخیر تنظیم‌شده خود را دارد.</w:t>
       </w:r>
     </w:p>
     <w:p>
@@ -8215,7 +7594,7 @@
           <w:bCs w:val="0"/>
           <w:lang w:val="en-US" w:bidi="fa-IR"/>
         </w:rPr>
-        <w:t xml:space="preserve">هر هفت سناریوی تکلیف روی باینری تحویلی موفق ثبت شده‌اند. سناریوی دوم در دو پرواز مستقل از </w:t>
+        <w:t xml:space="preserve">هر هفت سناریوی تکلیف با باینری تحویلی موفق بوده‌اند. سناریوی دوم، یک بار از </w:t>
       </w:r>
       <w:r>
         <w:rPr>
@@ -8228,7 +7607,7 @@
           <w:bCs w:val="0"/>
           <w:lang w:val="en-US" w:bidi="fa-IR"/>
         </w:rPr>
-        <w:t>‎MANUAL‎</w:t>
+        <w:t xml:space="preserve">‎MANUAL‎ </w:t>
       </w:r>
       <w:r>
         <w:rPr>
@@ -8241,7 +7620,124 @@
           <w:bCs w:val="0"/>
           <w:lang w:val="en-US" w:bidi="fa-IR"/>
         </w:rPr>
-        <w:t xml:space="preserve"> </w:t>
+        <w:t xml:space="preserve">و یک بار از </w:t>
+      </w:r>
+      <w:r>
+        <w:rPr>
+          <w:rFonts w:ascii="Vazirmatn" w:hAnsi="Vazirmatn" w:cs="Vazirmatn" w:eastAsia="Vazirmatn"/>
+          <w:b w:val="0"/>
+          <w:color w:val="000000"/>
+          <w:sz w:val="23"/>
+          <w:szCs w:val="23"/>
+          <w:rtl w:val="0"/>
+          <w:bCs w:val="0"/>
+          <w:lang w:val="en-US" w:bidi="fa-IR"/>
+        </w:rPr>
+        <w:t xml:space="preserve">‎AUTO‎ </w:t>
+      </w:r>
+      <w:r>
+        <w:rPr>
+          <w:rFonts w:ascii="Vazirmatn" w:hAnsi="Vazirmatn" w:cs="Vazirmatn" w:eastAsia="Vazirmatn"/>
+          <w:b w:val="0"/>
+          <w:color w:val="000000"/>
+          <w:sz w:val="23"/>
+          <w:szCs w:val="23"/>
+          <w:rtl w:val="1"/>
+          <w:bCs w:val="0"/>
+          <w:lang w:val="en-US" w:bidi="fa-IR"/>
+        </w:rPr>
+        <w:t xml:space="preserve">اجرا شده؛ پس مجموعه پذیرش، هشت پرواز دارد. نتیجه‌ها با بررسی هم‌زمان پیام‌های </w:t>
+      </w:r>
+      <w:r>
+        <w:rPr>
+          <w:rFonts w:ascii="Vazirmatn" w:hAnsi="Vazirmatn" w:cs="Vazirmatn" w:eastAsia="Vazirmatn"/>
+          <w:b w:val="0"/>
+          <w:color w:val="000000"/>
+          <w:sz w:val="23"/>
+          <w:szCs w:val="23"/>
+          <w:rtl w:val="0"/>
+          <w:bCs w:val="0"/>
+          <w:lang w:val="en-US" w:bidi="fa-IR"/>
+        </w:rPr>
+        <w:t xml:space="preserve">‎RSC‎</w:t>
+      </w:r>
+      <w:r>
+        <w:rPr>
+          <w:rFonts w:ascii="Vazirmatn" w:hAnsi="Vazirmatn" w:cs="Vazirmatn" w:eastAsia="Vazirmatn"/>
+          <w:b w:val="0"/>
+          <w:color w:val="000000"/>
+          <w:sz w:val="23"/>
+          <w:szCs w:val="23"/>
+          <w:rtl w:val="1"/>
+          <w:bCs w:val="0"/>
+          <w:lang w:val="en-US" w:bidi="fa-IR"/>
+        </w:rPr>
+        <w:t xml:space="preserve">، </w:t>
+      </w:r>
+      <w:r>
+        <w:rPr>
+          <w:rFonts w:ascii="Vazirmatn" w:hAnsi="Vazirmatn" w:cs="Vazirmatn" w:eastAsia="Vazirmatn"/>
+          <w:b w:val="0"/>
+          <w:color w:val="000000"/>
+          <w:sz w:val="23"/>
+          <w:szCs w:val="23"/>
+          <w:rtl w:val="0"/>
+          <w:bCs w:val="0"/>
+          <w:lang w:val="en-US" w:bidi="fa-IR"/>
+        </w:rPr>
+        <w:t xml:space="preserve">‎MODE‎</w:t>
+      </w:r>
+      <w:r>
+        <w:rPr>
+          <w:rFonts w:ascii="Vazirmatn" w:hAnsi="Vazirmatn" w:cs="Vazirmatn" w:eastAsia="Vazirmatn"/>
+          <w:b w:val="0"/>
+          <w:color w:val="000000"/>
+          <w:sz w:val="23"/>
+          <w:szCs w:val="23"/>
+          <w:rtl w:val="1"/>
+          <w:bCs w:val="0"/>
+          <w:lang w:val="en-US" w:bidi="fa-IR"/>
+        </w:rPr>
+        <w:t xml:space="preserve">، </w:t>
+      </w:r>
+      <w:r>
+        <w:rPr>
+          <w:rFonts w:ascii="Vazirmatn" w:hAnsi="Vazirmatn" w:cs="Vazirmatn" w:eastAsia="Vazirmatn"/>
+          <w:b w:val="0"/>
+          <w:color w:val="000000"/>
+          <w:sz w:val="23"/>
+          <w:szCs w:val="23"/>
+          <w:rtl w:val="0"/>
+          <w:bCs w:val="0"/>
+          <w:lang w:val="en-US" w:bidi="fa-IR"/>
+        </w:rPr>
+        <w:t xml:space="preserve">‎TECS‎</w:t>
+      </w:r>
+      <w:r>
+        <w:rPr>
+          <w:rFonts w:ascii="Vazirmatn" w:hAnsi="Vazirmatn" w:cs="Vazirmatn" w:eastAsia="Vazirmatn"/>
+          <w:b w:val="0"/>
+          <w:color w:val="000000"/>
+          <w:sz w:val="23"/>
+          <w:szCs w:val="23"/>
+          <w:rtl w:val="1"/>
+          <w:bCs w:val="0"/>
+          <w:lang w:val="en-US" w:bidi="fa-IR"/>
+        </w:rPr>
+        <w:t xml:space="preserve">، </w:t>
+      </w:r>
+      <w:r>
+        <w:rPr>
+          <w:rFonts w:ascii="Vazirmatn" w:hAnsi="Vazirmatn" w:cs="Vazirmatn" w:eastAsia="Vazirmatn"/>
+          <w:b w:val="0"/>
+          <w:color w:val="000000"/>
+          <w:sz w:val="23"/>
+          <w:szCs w:val="23"/>
+          <w:rtl w:val="0"/>
+          <w:bCs w:val="0"/>
+          <w:lang w:val="en-US" w:bidi="fa-IR"/>
+        </w:rPr>
+        <w:t xml:space="preserve">‎RCOU‎ </w:t>
       </w:r>
       <w:r>
         <w:rPr>
@@ -8267,7 +7763,7 @@
           <w:bCs w:val="0"/>
           <w:lang w:val="en-US" w:bidi="fa-IR"/>
         </w:rPr>
-        <w:t>‎AUTO‎</w:t>
+        <w:t xml:space="preserve">‎ARM‎ </w:t>
       </w:r>
       <w:r>
         <w:rPr>
@@ -8280,7 +7776,20 @@
           <w:bCs w:val="0"/>
           <w:lang w:val="en-US" w:bidi="fa-IR"/>
         </w:rPr>
-        <w:t xml:space="preserve"> </w:t>
+        <w:t xml:space="preserve">در فایل </w:t>
+      </w:r>
+      <w:r>
+        <w:rPr>
+          <w:rFonts w:ascii="Vazirmatn" w:hAnsi="Vazirmatn" w:cs="Vazirmatn" w:eastAsia="Vazirmatn"/>
+          <w:b w:val="0"/>
+          <w:color w:val="000000"/>
+          <w:sz w:val="23"/>
+          <w:szCs w:val="23"/>
+          <w:rtl w:val="0"/>
+          <w:bCs w:val="0"/>
+          <w:lang w:val="en-US" w:bidi="fa-IR"/>
+        </w:rPr>
+        <w:t xml:space="preserve">‎BIN‎ </w:t>
       </w:r>
       <w:r>
         <w:rPr>
@@ -8293,202 +7802,7 @@
           <w:bCs w:val="0"/>
           <w:lang w:val="en-US" w:bidi="fa-IR"/>
         </w:rPr>
-        <w:t xml:space="preserve">اجرا شده است؛ بنابراین پوشش پذیرش شامل هشت پرواز است. نتیجه‌ها از فایل </w:t>
-      </w:r>
-      <w:r>
-        <w:rPr>
-          <w:rFonts w:ascii="Vazirmatn" w:hAnsi="Vazirmatn" w:cs="Vazirmatn" w:eastAsia="Vazirmatn"/>
-          <w:b w:val="0"/>
-          <w:color w:val="000000"/>
-          <w:sz w:val="23"/>
-          <w:szCs w:val="23"/>
-          <w:rtl w:val="0"/>
-          <w:bCs w:val="0"/>
-          <w:lang w:val="en-US" w:bidi="fa-IR"/>
-        </w:rPr>
-        <w:t>‎BIN‎</w:t>
-      </w:r>
-      <w:r>
-        <w:rPr>
-          <w:rFonts w:ascii="Vazirmatn" w:hAnsi="Vazirmatn" w:cs="Vazirmatn" w:eastAsia="Vazirmatn"/>
-          <w:b w:val="0"/>
-          <w:color w:val="000000"/>
-          <w:sz w:val="23"/>
-          <w:szCs w:val="23"/>
-          <w:rtl w:val="1"/>
-          <w:bCs w:val="0"/>
-          <w:lang w:val="en-US" w:bidi="fa-IR"/>
-        </w:rPr>
-        <w:t xml:space="preserve"> </w:t>
-      </w:r>
-      <w:r>
-        <w:rPr>
-          <w:rFonts w:ascii="Vazirmatn" w:hAnsi="Vazirmatn" w:cs="Vazirmatn" w:eastAsia="Vazirmatn"/>
-          <w:b w:val="0"/>
-          <w:color w:val="000000"/>
-          <w:sz w:val="23"/>
-          <w:szCs w:val="23"/>
-          <w:rtl w:val="1"/>
-          <w:bCs w:val="0"/>
-          <w:lang w:val="en-US" w:bidi="fa-IR"/>
-        </w:rPr>
-        <w:t xml:space="preserve">اصلی و هم‌زمانی </w:t>
-      </w:r>
-      <w:r>
-        <w:rPr>
-          <w:rFonts w:ascii="Vazirmatn" w:hAnsi="Vazirmatn" w:cs="Vazirmatn" w:eastAsia="Vazirmatn"/>
-          <w:b w:val="0"/>
-          <w:color w:val="000000"/>
-          <w:sz w:val="23"/>
-          <w:szCs w:val="23"/>
-          <w:rtl w:val="0"/>
-          <w:bCs w:val="0"/>
-          <w:lang w:val="en-US" w:bidi="fa-IR"/>
-        </w:rPr>
-        <w:t>‎RSC‎</w:t>
-      </w:r>
-      <w:r>
-        <w:rPr>
-          <w:rFonts w:ascii="Vazirmatn" w:hAnsi="Vazirmatn" w:cs="Vazirmatn" w:eastAsia="Vazirmatn"/>
-          <w:b w:val="0"/>
-          <w:color w:val="000000"/>
-          <w:sz w:val="23"/>
-          <w:szCs w:val="23"/>
-          <w:rtl w:val="1"/>
-          <w:bCs w:val="0"/>
-          <w:lang w:val="en-US" w:bidi="fa-IR"/>
-        </w:rPr>
-        <w:t xml:space="preserve">، </w:t>
-      </w:r>
-      <w:r>
-        <w:rPr>
-          <w:rFonts w:ascii="Vazirmatn" w:hAnsi="Vazirmatn" w:cs="Vazirmatn" w:eastAsia="Vazirmatn"/>
-          <w:b w:val="0"/>
-          <w:color w:val="000000"/>
-          <w:sz w:val="23"/>
-          <w:szCs w:val="23"/>
-          <w:rtl w:val="0"/>
-          <w:bCs w:val="0"/>
-          <w:lang w:val="en-US" w:bidi="fa-IR"/>
-        </w:rPr>
-        <w:t>‎MODE‎</w:t>
-      </w:r>
-      <w:r>
-        <w:rPr>
-          <w:rFonts w:ascii="Vazirmatn" w:hAnsi="Vazirmatn" w:cs="Vazirmatn" w:eastAsia="Vazirmatn"/>
-          <w:b w:val="0"/>
-          <w:color w:val="000000"/>
-          <w:sz w:val="23"/>
-          <w:szCs w:val="23"/>
-          <w:rtl w:val="1"/>
-          <w:bCs w:val="0"/>
-          <w:lang w:val="en-US" w:bidi="fa-IR"/>
-        </w:rPr>
-        <w:t xml:space="preserve">، </w:t>
-      </w:r>
-      <w:r>
-        <w:rPr>
-          <w:rFonts w:ascii="Vazirmatn" w:hAnsi="Vazirmatn" w:cs="Vazirmatn" w:eastAsia="Vazirmatn"/>
-          <w:b w:val="0"/>
-          <w:color w:val="000000"/>
-          <w:sz w:val="23"/>
-          <w:szCs w:val="23"/>
-          <w:rtl w:val="0"/>
-          <w:bCs w:val="0"/>
-          <w:lang w:val="en-US" w:bidi="fa-IR"/>
-        </w:rPr>
-        <w:t>‎TECS‎</w:t>
-      </w:r>
-      <w:r>
-        <w:rPr>
-          <w:rFonts w:ascii="Vazirmatn" w:hAnsi="Vazirmatn" w:cs="Vazirmatn" w:eastAsia="Vazirmatn"/>
-          <w:b w:val="0"/>
-          <w:color w:val="000000"/>
-          <w:sz w:val="23"/>
-          <w:szCs w:val="23"/>
-          <w:rtl w:val="1"/>
-          <w:bCs w:val="0"/>
-          <w:lang w:val="en-US" w:bidi="fa-IR"/>
-        </w:rPr>
-        <w:t xml:space="preserve">، </w:t>
-      </w:r>
-      <w:r>
-        <w:rPr>
-          <w:rFonts w:ascii="Vazirmatn" w:hAnsi="Vazirmatn" w:cs="Vazirmatn" w:eastAsia="Vazirmatn"/>
-          <w:b w:val="0"/>
-          <w:color w:val="000000"/>
-          <w:sz w:val="23"/>
-          <w:szCs w:val="23"/>
-          <w:rtl w:val="0"/>
-          <w:bCs w:val="0"/>
-          <w:lang w:val="en-US" w:bidi="fa-IR"/>
-        </w:rPr>
-        <w:t>‎RCOU‎</w:t>
-      </w:r>
-      <w:r>
-        <w:rPr>
-          <w:rFonts w:ascii="Vazirmatn" w:hAnsi="Vazirmatn" w:cs="Vazirmatn" w:eastAsia="Vazirmatn"/>
-          <w:b w:val="0"/>
-          <w:color w:val="000000"/>
-          <w:sz w:val="23"/>
-          <w:szCs w:val="23"/>
-          <w:rtl w:val="1"/>
-          <w:bCs w:val="0"/>
-          <w:lang w:val="en-US" w:bidi="fa-IR"/>
-        </w:rPr>
-        <w:t xml:space="preserve"> </w:t>
-      </w:r>
-      <w:r>
-        <w:rPr>
-          <w:rFonts w:ascii="Vazirmatn" w:hAnsi="Vazirmatn" w:cs="Vazirmatn" w:eastAsia="Vazirmatn"/>
-          <w:b w:val="0"/>
-          <w:color w:val="000000"/>
-          <w:sz w:val="23"/>
-          <w:szCs w:val="23"/>
-          <w:rtl w:val="1"/>
-          <w:bCs w:val="0"/>
-          <w:lang w:val="en-US" w:bidi="fa-IR"/>
-        </w:rPr>
-        <w:t xml:space="preserve">و </w:t>
-      </w:r>
-      <w:r>
-        <w:rPr>
-          <w:rFonts w:ascii="Vazirmatn" w:hAnsi="Vazirmatn" w:cs="Vazirmatn" w:eastAsia="Vazirmatn"/>
-          <w:b w:val="0"/>
-          <w:color w:val="000000"/>
-          <w:sz w:val="23"/>
-          <w:szCs w:val="23"/>
-          <w:rtl w:val="0"/>
-          <w:bCs w:val="0"/>
-          <w:lang w:val="en-US" w:bidi="fa-IR"/>
-        </w:rPr>
-        <w:t>‎ARM‎</w:t>
-      </w:r>
-      <w:r>
-        <w:rPr>
-          <w:rFonts w:ascii="Vazirmatn" w:hAnsi="Vazirmatn" w:cs="Vazirmatn" w:eastAsia="Vazirmatn"/>
-          <w:b w:val="0"/>
-          <w:color w:val="000000"/>
-          <w:sz w:val="23"/>
-          <w:szCs w:val="23"/>
-          <w:rtl w:val="1"/>
-          <w:bCs w:val="0"/>
-          <w:lang w:val="en-US" w:bidi="fa-IR"/>
-        </w:rPr>
-        <w:t xml:space="preserve"> </w:t>
-      </w:r>
-      <w:r>
-        <w:rPr>
-          <w:rFonts w:ascii="Vazirmatn" w:hAnsi="Vazirmatn" w:cs="Vazirmatn" w:eastAsia="Vazirmatn"/>
-          <w:b w:val="0"/>
-          <w:color w:val="000000"/>
-          <w:sz w:val="23"/>
-          <w:szCs w:val="23"/>
-          <w:rtl w:val="1"/>
-          <w:bCs w:val="0"/>
-          <w:lang w:val="en-US" w:bidi="fa-IR"/>
-        </w:rPr>
-        <w:t>استخراج شده‌اند.</w:t>
+        <w:t xml:space="preserve">اصلی به دست آمده‌اند.</w:t>
       </w:r>
     </w:p>
     <w:tbl>
@@ -9595,7 +8909,7 @@
           <w:bCs w:val="0"/>
           <w:lang w:val="en-US" w:bidi="fa-IR"/>
         </w:rPr>
-        <w:t>چهارده رگرسیون مهندسی علاوه بر پذیرش بررسی شده‌اند: پرواز و تیک‌آف عادی، گذرای کوتاه، نزول معمول، نزول تند ثابت، بالاکشیدن موفق و رهاشده، بانک و شکست پیشران. این‌ها گزینه‌های اضافی پذیرش در پنل نیستند. در یک اجرای نزول معمول، مهلت نزدیک‌شدنِ ابزار آزمون زود تمام شد؛ تکرار همان شرط با زمان بیشتر و بدون تغییر فریمور موفق بود. هر دو ثبت نگه داشته شده‌اند.</w:t>
+        <w:t xml:space="preserve">چهارده آزمون تکمیلی هم پرواز و تیک‌آف عادی، مانور کوتاه، نزول معمول، نزول تند ثابت، بالاکشیدن موفق و رهاشده، گردش با رول و خرابی پیشران را بررسی کرده‌اند. این‌ها گزینه اضافی در فهرست هفت آزمون پنل نیستند. در یک اجرای نزول معمول، مهلت ابزار آزمون پیش از رسیدن به ارتفاع موردنظر تمام شد؛ همان آزمون با زمان بیشتر و بدون تغییر فریمور موفق بود. هر دو ثبت حفظ شده‌اند.</w:t>
       </w:r>
     </w:p>
     <w:p>
@@ -9616,7 +8930,7 @@
           <w:bCs w:val="0"/>
           <w:lang w:val="en-US" w:bidi="fa-IR"/>
         </w:rPr>
-        <w:t>ویدئوها بازپخش گرافیکی داده‌های واقعیِ شبیه‌ساز هستند، نه فیلم پرنده واقعی. بازآزمایی سناریوی بدون پاسخ برای ثبت کامل بازشدن چتر نیز جدا نگه داشته شده است. مجموعه اصلی همچنان همان هفت سناریو و هشت پرواز پذیرش است.</w:t>
+        <w:t xml:space="preserve">ویدئوها، بازپخش گرافیکی داده‌های شبیه‌سازند. برای نمایش کامل بازشدن چتر و رسیدن مدل به زمین، سناریوی بدون پاسخ را یک بار دیگر اجرا و جدا ثبت کرده‌ایم. این تکرار، تعداد هفت سناریو و هشت پرواز مجموعه پذیرش را تغییر نمی‌دهد.</w:t>
       </w:r>
     </w:p>
     <w:p>
@@ -9637,7 +8951,7 @@
           <w:bCs w:val="0"/>
           <w:lang w:val="en-US" w:bidi="fa-IR"/>
         </w:rPr>
-        <w:t xml:space="preserve">فهرست شواهد، هش باینری و هر شرط کنترل‌شده در </w:t>
+        <w:t xml:space="preserve">فهرست شواهد، هش باینری و نتیجه بررسی هر شرط در </w:t>
       </w:r>
       <w:r>
         <w:rPr>
@@ -9650,7 +8964,7 @@
           <w:bCs w:val="0"/>
           <w:lang w:val="en-US" w:bidi="fa-IR"/>
         </w:rPr>
-        <w:t>‎low-height-verification.json‎</w:t>
+        <w:t xml:space="preserve">‎low-height-verification.json‎ </w:t>
       </w:r>
       <w:r>
         <w:rPr>
@@ -9663,20 +8977,7 @@
           <w:bCs w:val="0"/>
           <w:lang w:val="en-US" w:bidi="fa-IR"/>
         </w:rPr>
-        <w:t xml:space="preserve"> </w:t>
-      </w:r>
-      <w:r>
-        <w:rPr>
-          <w:rFonts w:ascii="Vazirmatn" w:hAnsi="Vazirmatn" w:cs="Vazirmatn" w:eastAsia="Vazirmatn"/>
-          <w:b w:val="0"/>
-          <w:color w:val="000000"/>
-          <w:sz w:val="23"/>
-          <w:szCs w:val="23"/>
-          <w:rtl w:val="1"/>
-          <w:bCs w:val="0"/>
-          <w:lang w:val="en-US" w:bidi="fa-IR"/>
-        </w:rPr>
-        <w:t>آمده است. آزمایش‌های حاضر تضمین عملکرد روی سخت‌افزار واقعی، زمین متغیر یا هر نوع پرنده را ایجاد نمی‌کنند.</w:t>
+        <w:t xml:space="preserve">آمده است. این نتایج به شبیه‌ساز و مدل آزموده‌شده مربوط‌اند و تأیید عملکرد روی سخت‌افزار واقعی یا هر نوع پرنده و زمین نیستند.</w:t>
       </w:r>
     </w:p>
     <w:sectPr>

</xml_diff>